<commit_message>
Updating index.html with relevant career information
</commit_message>
<xml_diff>
--- a/assets/RyanRiccioResume.docx
+++ b/assets/RyanRiccioResume.docx
@@ -55,11 +55,97 @@
         <w:contextualSpacing/>
         <w:rPr>
           <w:rFonts w:ascii="Times New Roman" w:hAnsi="Times New Roman" w:cs="Times New Roman"/>
+          <w:i/>
+          <w:szCs w:val="21"/>
+        </w:rPr>
+      </w:pPr>
+      <w:r>
+        <w:rPr>
+          <w:rFonts w:ascii="Times New Roman" w:hAnsi="Times New Roman" w:cs="Times New Roman"/>
           <w:b/>
-          <w:sz w:val="12"/>
-          <w:szCs w:val="12"/>
-        </w:rPr>
-      </w:pPr>
+          <w:szCs w:val="21"/>
+        </w:rPr>
+        <w:t xml:space="preserve">Villanova University – </w:t>
+      </w:r>
+      <w:r>
+        <w:rPr>
+          <w:rFonts w:ascii="Times New Roman" w:hAnsi="Times New Roman" w:cs="Times New Roman"/>
+          <w:bCs/>
+          <w:szCs w:val="21"/>
+        </w:rPr>
+        <w:t>B</w:t>
+      </w:r>
+      <w:r>
+        <w:rPr>
+          <w:rFonts w:ascii="Times New Roman" w:hAnsi="Times New Roman" w:cs="Times New Roman"/>
+          <w:bCs/>
+          <w:szCs w:val="21"/>
+        </w:rPr>
+        <w:t xml:space="preserve">achelor of Science </w:t>
+      </w:r>
+      <w:r>
+        <w:rPr>
+          <w:rFonts w:ascii="Times New Roman" w:hAnsi="Times New Roman" w:cs="Times New Roman"/>
+          <w:bCs/>
+          <w:szCs w:val="21"/>
+        </w:rPr>
+        <w:t>in</w:t>
+      </w:r>
+      <w:r>
+        <w:rPr>
+          <w:rFonts w:ascii="Times New Roman" w:hAnsi="Times New Roman" w:cs="Times New Roman"/>
+          <w:bCs/>
+          <w:szCs w:val="21"/>
+        </w:rPr>
+        <w:t xml:space="preserve"> Computer Science</w:t>
+      </w:r>
+      <w:r>
+        <w:rPr>
+          <w:rFonts w:ascii="Times New Roman" w:hAnsi="Times New Roman" w:cs="Times New Roman"/>
+          <w:szCs w:val="21"/>
+        </w:rPr>
+        <w:t>, Villanova, PA</w:t>
+      </w:r>
+      <w:r>
+        <w:rPr>
+          <w:rFonts w:ascii="Times New Roman" w:hAnsi="Times New Roman" w:cs="Times New Roman"/>
+          <w:b/>
+          <w:szCs w:val="21"/>
+        </w:rPr>
+        <w:t xml:space="preserve"> (</w:t>
+      </w:r>
+      <w:r>
+        <w:rPr>
+          <w:rFonts w:ascii="Times New Roman" w:hAnsi="Times New Roman" w:cs="Times New Roman"/>
+          <w:i/>
+          <w:szCs w:val="21"/>
+        </w:rPr>
+        <w:t>May 20</w:t>
+      </w:r>
+      <w:r>
+        <w:rPr>
+          <w:rFonts w:ascii="Times New Roman" w:hAnsi="Times New Roman" w:cs="Times New Roman"/>
+          <w:i/>
+          <w:szCs w:val="21"/>
+        </w:rPr>
+        <w:t>2</w:t>
+      </w:r>
+      <w:r>
+        <w:rPr>
+          <w:rFonts w:ascii="Times New Roman" w:hAnsi="Times New Roman" w:cs="Times New Roman"/>
+          <w:i/>
+          <w:szCs w:val="21"/>
+        </w:rPr>
+        <w:t>7</w:t>
+      </w:r>
+      <w:r>
+        <w:rPr>
+          <w:rFonts w:ascii="Times New Roman" w:hAnsi="Times New Roman" w:cs="Times New Roman"/>
+          <w:i/>
+          <w:szCs w:val="21"/>
+        </w:rPr>
+        <w:t>)</w:t>
+      </w:r>
     </w:p>
     <w:p>
       <w:pPr>
@@ -67,96 +153,22 @@
         <w:contextualSpacing/>
         <w:rPr>
           <w:rFonts w:ascii="Times New Roman" w:hAnsi="Times New Roman" w:cs="Times New Roman"/>
-          <w:i/>
-          <w:szCs w:val="21"/>
-        </w:rPr>
-      </w:pPr>
-      <w:r>
-        <w:rPr>
-          <w:rFonts w:ascii="Times New Roman" w:hAnsi="Times New Roman" w:cs="Times New Roman"/>
-          <w:b/>
-          <w:szCs w:val="21"/>
-        </w:rPr>
-        <w:t xml:space="preserve">Villanova University – </w:t>
-      </w:r>
-      <w:r>
-        <w:rPr>
-          <w:rFonts w:ascii="Times New Roman" w:hAnsi="Times New Roman" w:cs="Times New Roman"/>
-          <w:bCs/>
-          <w:szCs w:val="21"/>
-        </w:rPr>
-        <w:t>B</w:t>
-      </w:r>
-      <w:r>
-        <w:rPr>
-          <w:rFonts w:ascii="Times New Roman" w:hAnsi="Times New Roman" w:cs="Times New Roman"/>
-          <w:bCs/>
-          <w:szCs w:val="21"/>
-        </w:rPr>
-        <w:t xml:space="preserve">achelor of Science </w:t>
-      </w:r>
-      <w:r>
-        <w:rPr>
-          <w:rFonts w:ascii="Times New Roman" w:hAnsi="Times New Roman" w:cs="Times New Roman"/>
-          <w:bCs/>
-          <w:szCs w:val="21"/>
-        </w:rPr>
-        <w:t>in</w:t>
-      </w:r>
-      <w:r>
-        <w:rPr>
-          <w:rFonts w:ascii="Times New Roman" w:hAnsi="Times New Roman" w:cs="Times New Roman"/>
-          <w:bCs/>
-          <w:szCs w:val="21"/>
-        </w:rPr>
-        <w:t xml:space="preserve"> Computer Science</w:t>
-      </w:r>
-      <w:r>
-        <w:rPr>
-          <w:rFonts w:ascii="Times New Roman" w:hAnsi="Times New Roman" w:cs="Times New Roman"/>
-          <w:szCs w:val="21"/>
-        </w:rPr>
-        <w:t>, Villanova, PA</w:t>
-      </w:r>
-      <w:r>
-        <w:rPr>
-          <w:rFonts w:ascii="Times New Roman" w:hAnsi="Times New Roman" w:cs="Times New Roman"/>
-          <w:b/>
-          <w:szCs w:val="21"/>
-        </w:rPr>
-        <w:t xml:space="preserve"> (</w:t>
-      </w:r>
-      <w:r>
-        <w:rPr>
-          <w:rFonts w:ascii="Times New Roman" w:hAnsi="Times New Roman" w:cs="Times New Roman"/>
-          <w:i/>
-          <w:szCs w:val="21"/>
-        </w:rPr>
-        <w:t>May 20</w:t>
-      </w:r>
-      <w:r>
-        <w:rPr>
-          <w:rFonts w:ascii="Times New Roman" w:hAnsi="Times New Roman" w:cs="Times New Roman"/>
-          <w:i/>
-          <w:szCs w:val="21"/>
-        </w:rPr>
-        <w:t>2</w:t>
-      </w:r>
-      <w:r>
-        <w:rPr>
-          <w:rFonts w:ascii="Times New Roman" w:hAnsi="Times New Roman" w:cs="Times New Roman"/>
-          <w:i/>
-          <w:szCs w:val="21"/>
-        </w:rPr>
-        <w:t>7</w:t>
-      </w:r>
-      <w:r>
-        <w:rPr>
-          <w:rFonts w:ascii="Times New Roman" w:hAnsi="Times New Roman" w:cs="Times New Roman"/>
-          <w:i/>
-          <w:szCs w:val="21"/>
-        </w:rPr>
-        <w:t>)</w:t>
+          <w:szCs w:val="21"/>
+        </w:rPr>
+      </w:pPr>
+      <w:r>
+        <w:rPr>
+          <w:rFonts w:ascii="Times New Roman" w:hAnsi="Times New Roman" w:cs="Times New Roman"/>
+          <w:szCs w:val="21"/>
+        </w:rPr>
+        <w:t>GPA: 3.</w:t>
+      </w:r>
+      <w:r>
+        <w:rPr>
+          <w:rFonts w:ascii="Times New Roman" w:hAnsi="Times New Roman" w:cs="Times New Roman"/>
+          <w:szCs w:val="21"/>
+        </w:rPr>
+        <w:t>8</w:t>
       </w:r>
     </w:p>
     <w:p>
@@ -165,30 +177,6 @@
         <w:contextualSpacing/>
         <w:rPr>
           <w:rFonts w:ascii="Times New Roman" w:hAnsi="Times New Roman" w:cs="Times New Roman"/>
-          <w:szCs w:val="21"/>
-        </w:rPr>
-      </w:pPr>
-      <w:r>
-        <w:rPr>
-          <w:rFonts w:ascii="Times New Roman" w:hAnsi="Times New Roman" w:cs="Times New Roman"/>
-          <w:szCs w:val="21"/>
-        </w:rPr>
-        <w:t>GPA: 3.</w:t>
-      </w:r>
-      <w:r>
-        <w:rPr>
-          <w:rFonts w:ascii="Times New Roman" w:hAnsi="Times New Roman" w:cs="Times New Roman"/>
-          <w:szCs w:val="21"/>
-        </w:rPr>
-        <w:t>8</w:t>
-      </w:r>
-    </w:p>
-    <w:p>
-      <w:pPr>
-        <w:spacing w:after="0" w:line="240" w:lineRule="auto"/>
-        <w:contextualSpacing/>
-        <w:rPr>
-          <w:rFonts w:ascii="Times New Roman" w:hAnsi="Times New Roman" w:cs="Times New Roman"/>
           <w:sz w:val="20"/>
           <w:szCs w:val="20"/>
         </w:rPr>
@@ -207,7 +195,7 @@
           <w:sz w:val="20"/>
           <w:szCs w:val="20"/>
         </w:rPr>
-        <w:t>: Algorithms &amp; Data Structures,</w:t>
+        <w:t xml:space="preserve">: </w:t>
       </w:r>
       <w:r>
         <w:rPr>
@@ -215,7 +203,7 @@
           <w:sz w:val="20"/>
           <w:szCs w:val="20"/>
         </w:rPr>
-        <w:t xml:space="preserve"> Computer Systems, </w:t>
+        <w:t xml:space="preserve">Principles of Database </w:t>
       </w:r>
       <w:r>
         <w:rPr>
@@ -223,7 +211,7 @@
           <w:sz w:val="20"/>
           <w:szCs w:val="20"/>
         </w:rPr>
-        <w:t xml:space="preserve">Principles of Database </w:t>
+        <w:t>Systems</w:t>
       </w:r>
       <w:r>
         <w:rPr>
@@ -231,7 +219,7 @@
           <w:sz w:val="20"/>
           <w:szCs w:val="20"/>
         </w:rPr>
-        <w:t>Systems</w:t>
+        <w:t xml:space="preserve"> (SQL)</w:t>
       </w:r>
       <w:r>
         <w:rPr>
@@ -239,7 +227,7 @@
           <w:sz w:val="20"/>
           <w:szCs w:val="20"/>
         </w:rPr>
-        <w:t xml:space="preserve"> (SQL)</w:t>
+        <w:t xml:space="preserve">, </w:t>
       </w:r>
       <w:r>
         <w:rPr>
@@ -247,7 +235,7 @@
           <w:sz w:val="20"/>
           <w:szCs w:val="20"/>
         </w:rPr>
-        <w:t xml:space="preserve">, </w:t>
+        <w:t>Platform-Based Computing</w:t>
       </w:r>
       <w:r>
         <w:rPr>
@@ -255,7 +243,7 @@
           <w:sz w:val="20"/>
           <w:szCs w:val="20"/>
         </w:rPr>
-        <w:t>Platform-Based Computing</w:t>
+        <w:t>, Organization of Programming Languages</w:t>
       </w:r>
       <w:r>
         <w:rPr>
@@ -263,7 +251,7 @@
           <w:sz w:val="20"/>
           <w:szCs w:val="20"/>
         </w:rPr>
-        <w:t>, Organization of Programming Languages</w:t>
+        <w:t xml:space="preserve">, </w:t>
       </w:r>
       <w:r>
         <w:rPr>
@@ -271,7 +259,7 @@
           <w:sz w:val="20"/>
           <w:szCs w:val="20"/>
         </w:rPr>
-        <w:t xml:space="preserve">, </w:t>
+        <w:t>Theory of Computation</w:t>
       </w:r>
       <w:r>
         <w:rPr>
@@ -279,7 +267,7 @@
           <w:sz w:val="20"/>
           <w:szCs w:val="20"/>
         </w:rPr>
-        <w:t>Theory of Computation</w:t>
+        <w:t>, Overview of Cybersecurity</w:t>
       </w:r>
       <w:r>
         <w:rPr>
@@ -287,7 +275,7 @@
           <w:sz w:val="20"/>
           <w:szCs w:val="20"/>
         </w:rPr>
-        <w:t>, Overview of Cybersecurity</w:t>
+        <w:t>, Computer Ethics</w:t>
       </w:r>
       <w:r>
         <w:rPr>
@@ -295,7 +283,7 @@
           <w:sz w:val="20"/>
           <w:szCs w:val="20"/>
         </w:rPr>
-        <w:t>, Computer Ethics</w:t>
+        <w:t>, Applied Machine Learning, Digital Forensics</w:t>
       </w:r>
     </w:p>
     <w:p>
@@ -307,7 +295,8 @@
         <w:rPr>
           <w:rFonts w:ascii="Times New Roman" w:hAnsi="Times New Roman" w:cs="Times New Roman"/>
           <w:b/>
-          <w:szCs w:val="21"/>
+          <w:sz w:val="8"/>
+          <w:szCs w:val="8"/>
         </w:rPr>
       </w:pPr>
     </w:p>
@@ -349,18 +338,6 @@
         </w:rPr>
         <w:t>SKILLS</w:t>
       </w:r>
-    </w:p>
-    <w:p>
-      <w:pPr>
-        <w:spacing w:after="0" w:line="240" w:lineRule="auto"/>
-        <w:contextualSpacing/>
-        <w:rPr>
-          <w:rFonts w:ascii="Times New Roman" w:hAnsi="Times New Roman" w:cs="Times New Roman"/>
-          <w:b/>
-          <w:sz w:val="12"/>
-          <w:szCs w:val="12"/>
-        </w:rPr>
-      </w:pPr>
     </w:p>
     <w:p>
       <w:pPr>
@@ -375,7 +352,7 @@
           <w:headerReference w:type="default" r:id="rId11"/>
           <w:type w:val="continuous"/>
           <w:pgSz w:w="12240" w:h="15840"/>
-          <w:pgMar w:top="1260" w:right="720" w:bottom="720" w:left="720" w:header="810" w:footer="720" w:gutter="0"/>
+          <w:pgMar w:top="720" w:right="720" w:bottom="720" w:left="720" w:header="720" w:footer="720" w:gutter="0"/>
           <w:cols w:space="720"/>
           <w:docGrid w:linePitch="299"/>
         </w:sectPr>
@@ -400,44 +377,14 @@
           <w:bCs/>
           <w:szCs w:val="21"/>
         </w:rPr>
-        <w:t>Languages:</w:t>
-      </w:r>
-      <w:r>
-        <w:rPr>
-          <w:rFonts w:ascii="Times New Roman" w:hAnsi="Times New Roman" w:cs="Times New Roman"/>
-          <w:b/>
-          <w:bCs/>
-          <w:szCs w:val="21"/>
-        </w:rPr>
-        <w:t xml:space="preserve"> </w:t>
-      </w:r>
-      <w:r>
-        <w:rPr>
-          <w:rFonts w:ascii="Times New Roman" w:hAnsi="Times New Roman" w:cs="Times New Roman"/>
-          <w:szCs w:val="21"/>
-        </w:rPr>
-        <w:t>Python, Java,</w:t>
-      </w:r>
-      <w:r>
-        <w:rPr>
-          <w:rFonts w:ascii="Times New Roman" w:hAnsi="Times New Roman" w:cs="Times New Roman"/>
-          <w:szCs w:val="21"/>
-        </w:rPr>
-        <w:t xml:space="preserve"> C,</w:t>
-      </w:r>
-      <w:r>
-        <w:rPr>
-          <w:rFonts w:ascii="Times New Roman" w:hAnsi="Times New Roman" w:cs="Times New Roman"/>
-          <w:szCs w:val="21"/>
-        </w:rPr>
-        <w:t xml:space="preserve"> JavaScript, </w:t>
-      </w:r>
-      <w:r>
-        <w:rPr>
-          <w:rFonts w:ascii="Times New Roman" w:hAnsi="Times New Roman" w:cs="Times New Roman"/>
-          <w:szCs w:val="21"/>
-        </w:rPr>
-        <w:t>HTML/CSS</w:t>
+        <w:t xml:space="preserve">Languages: </w:t>
+      </w:r>
+      <w:r>
+        <w:rPr>
+          <w:rFonts w:ascii="Times New Roman" w:hAnsi="Times New Roman" w:cs="Times New Roman"/>
+          <w:szCs w:val="21"/>
+        </w:rPr>
+        <w:t>Python, Java, C, JavaScript, SQL, HTML/CSS</w:t>
       </w:r>
     </w:p>
     <w:p>
@@ -449,18 +396,11 @@
         <w:contextualSpacing/>
         <w:rPr>
           <w:rFonts w:ascii="Times New Roman" w:hAnsi="Times New Roman" w:cs="Times New Roman"/>
-          <w:szCs w:val="21"/>
-        </w:rPr>
-      </w:pPr>
-      <w:r>
-        <w:rPr>
-          <w:rFonts w:ascii="Times New Roman" w:hAnsi="Times New Roman" w:cs="Times New Roman"/>
           <w:b/>
           <w:bCs/>
           <w:szCs w:val="21"/>
         </w:rPr>
-        <w:t>Frameworks:</w:t>
-      </w:r>
+      </w:pPr>
       <w:r>
         <w:rPr>
           <w:rFonts w:ascii="Times New Roman" w:hAnsi="Times New Roman" w:cs="Times New Roman"/>
@@ -468,35 +408,14 @@
           <w:bCs/>
           <w:szCs w:val="21"/>
         </w:rPr>
-        <w:t xml:space="preserve"> </w:t>
-      </w:r>
-      <w:r>
-        <w:rPr>
-          <w:rFonts w:ascii="Times New Roman" w:hAnsi="Times New Roman" w:cs="Times New Roman"/>
-          <w:szCs w:val="21"/>
-        </w:rPr>
-        <w:t xml:space="preserve">React, </w:t>
-      </w:r>
-      <w:r>
-        <w:rPr>
-          <w:rFonts w:ascii="Times New Roman" w:hAnsi="Times New Roman" w:cs="Times New Roman"/>
-          <w:szCs w:val="21"/>
-        </w:rPr>
-        <w:t>Bootstrap</w:t>
-      </w:r>
-      <w:r>
-        <w:rPr>
-          <w:rFonts w:ascii="Times New Roman" w:hAnsi="Times New Roman" w:cs="Times New Roman"/>
-          <w:szCs w:val="21"/>
-        </w:rPr>
-        <w:t xml:space="preserve">, </w:t>
-      </w:r>
-      <w:r>
-        <w:rPr>
-          <w:rFonts w:ascii="Times New Roman" w:hAnsi="Times New Roman" w:cs="Times New Roman"/>
-          <w:szCs w:val="21"/>
-        </w:rPr>
-        <w:t>Flask</w:t>
+        <w:t xml:space="preserve">Frameworks/Libraries: </w:t>
+      </w:r>
+      <w:r>
+        <w:rPr>
+          <w:rFonts w:ascii="Times New Roman" w:hAnsi="Times New Roman" w:cs="Times New Roman"/>
+          <w:szCs w:val="21"/>
+        </w:rPr>
+        <w:t>React, Flask, Bootstrap</w:t>
       </w:r>
     </w:p>
     <w:p>
@@ -518,28 +437,14 @@
           <w:bCs/>
           <w:szCs w:val="21"/>
         </w:rPr>
-        <w:t xml:space="preserve">Tools: </w:t>
-      </w:r>
-      <w:r>
-        <w:rPr>
-          <w:rFonts w:ascii="Times New Roman" w:hAnsi="Times New Roman" w:cs="Times New Roman"/>
-          <w:szCs w:val="21"/>
-        </w:rPr>
-        <w:t>Netlify, Render</w:t>
-      </w:r>
-      <w:r>
-        <w:rPr>
-          <w:rFonts w:ascii="Times New Roman" w:hAnsi="Times New Roman" w:cs="Times New Roman"/>
-          <w:szCs w:val="21"/>
-        </w:rPr>
-        <w:t>, GitHub</w:t>
-      </w:r>
-      <w:r>
-        <w:rPr>
-          <w:rFonts w:ascii="Times New Roman" w:hAnsi="Times New Roman" w:cs="Times New Roman"/>
-          <w:szCs w:val="21"/>
-        </w:rPr>
-        <w:t>, Git</w:t>
+        <w:t xml:space="preserve">Databases: </w:t>
+      </w:r>
+      <w:r>
+        <w:rPr>
+          <w:rFonts w:ascii="Times New Roman" w:hAnsi="Times New Roman" w:cs="Times New Roman"/>
+          <w:szCs w:val="21"/>
+        </w:rPr>
+        <w:t>PostgreSQL, Relational Database Design</w:t>
       </w:r>
     </w:p>
     <w:p>
@@ -551,24 +456,26 @@
         <w:contextualSpacing/>
         <w:rPr>
           <w:rFonts w:ascii="Times New Roman" w:hAnsi="Times New Roman" w:cs="Times New Roman"/>
-          <w:szCs w:val="21"/>
-        </w:rPr>
-      </w:pPr>
-      <w:r>
-        <w:rPr>
-          <w:rFonts w:ascii="Times New Roman" w:hAnsi="Times New Roman" w:cs="Times New Roman"/>
           <w:b/>
           <w:bCs/>
           <w:szCs w:val="21"/>
         </w:rPr>
-        <w:t>Methodologies</w:t>
-      </w:r>
-      <w:r>
-        <w:rPr>
-          <w:rFonts w:ascii="Times New Roman" w:hAnsi="Times New Roman" w:cs="Times New Roman"/>
-          <w:szCs w:val="21"/>
-        </w:rPr>
-        <w:t>: Agile Development, Scrum Practices, Iterative Development</w:t>
+      </w:pPr>
+      <w:r>
+        <w:rPr>
+          <w:rFonts w:ascii="Times New Roman" w:hAnsi="Times New Roman" w:cs="Times New Roman"/>
+          <w:b/>
+          <w:bCs/>
+          <w:szCs w:val="21"/>
+        </w:rPr>
+        <w:t xml:space="preserve">Developer Tools: </w:t>
+      </w:r>
+      <w:r>
+        <w:rPr>
+          <w:rFonts w:ascii="Times New Roman" w:hAnsi="Times New Roman" w:cs="Times New Roman"/>
+          <w:szCs w:val="21"/>
+        </w:rPr>
+        <w:t>Git, GitHub, Netlify, Render, TerminalFour CMS, DubBot</w:t>
       </w:r>
     </w:p>
     <w:p>
@@ -590,51 +497,14 @@
           <w:bCs/>
           <w:szCs w:val="21"/>
         </w:rPr>
-        <w:t>Databases:</w:t>
-      </w:r>
-      <w:r>
-        <w:rPr>
-          <w:rFonts w:ascii="Times New Roman" w:hAnsi="Times New Roman" w:cs="Times New Roman"/>
-          <w:b/>
-          <w:bCs/>
-          <w:szCs w:val="21"/>
-        </w:rPr>
-        <w:t xml:space="preserve"> </w:t>
-      </w:r>
-      <w:r>
-        <w:rPr>
-          <w:rFonts w:ascii="Times New Roman" w:hAnsi="Times New Roman" w:cs="Times New Roman"/>
-          <w:szCs w:val="21"/>
-        </w:rPr>
-        <w:t>Relational Database</w:t>
-      </w:r>
-      <w:r>
-        <w:rPr>
-          <w:rFonts w:ascii="Times New Roman" w:hAnsi="Times New Roman" w:cs="Times New Roman"/>
-          <w:szCs w:val="21"/>
-        </w:rPr>
-        <w:t xml:space="preserve"> Design</w:t>
-      </w:r>
-      <w:r>
-        <w:rPr>
-          <w:rFonts w:ascii="Times New Roman" w:hAnsi="Times New Roman" w:cs="Times New Roman"/>
-          <w:szCs w:val="21"/>
-        </w:rPr>
-        <w:t>,</w:t>
-      </w:r>
-      <w:r>
-        <w:rPr>
-          <w:rFonts w:ascii="Times New Roman" w:hAnsi="Times New Roman" w:cs="Times New Roman"/>
-          <w:szCs w:val="21"/>
-        </w:rPr>
-        <w:t xml:space="preserve"> PostgreSQL,</w:t>
-      </w:r>
-      <w:r>
-        <w:rPr>
-          <w:rFonts w:ascii="Times New Roman" w:hAnsi="Times New Roman" w:cs="Times New Roman"/>
-          <w:szCs w:val="21"/>
-        </w:rPr>
-        <w:t xml:space="preserve"> SQL</w:t>
+        <w:t xml:space="preserve">Concepts: </w:t>
+      </w:r>
+      <w:r>
+        <w:rPr>
+          <w:rFonts w:ascii="Times New Roman" w:hAnsi="Times New Roman" w:cs="Times New Roman"/>
+          <w:szCs w:val="21"/>
+        </w:rPr>
+        <w:t>REST APIs, Authentication, Agile/Scrum, Software Testing, WCAG Accessibility</w:t>
       </w:r>
     </w:p>
     <w:p>
@@ -679,50 +549,389 @@
           <w:b/>
           <w:szCs w:val="21"/>
         </w:rPr>
-        <w:t>PROJECTS</w:t>
+        <w:t xml:space="preserve">TECHNICAL EXPERIENCE </w:t>
       </w:r>
     </w:p>
     <w:p>
       <w:pPr>
-        <w:pStyle w:val="NoSpacing"/>
-        <w:rPr>
-          <w:sz w:val="16"/>
-          <w:szCs w:val="16"/>
-        </w:rPr>
-      </w:pPr>
+        <w:spacing w:after="0" w:line="240" w:lineRule="auto"/>
+        <w:contextualSpacing/>
+        <w:rPr>
+          <w:rFonts w:ascii="Times New Roman" w:hAnsi="Times New Roman" w:cs="Times New Roman"/>
+          <w:bCs/>
+          <w:szCs w:val="21"/>
+        </w:rPr>
+      </w:pPr>
+      <w:r>
+        <w:rPr>
+          <w:rFonts w:ascii="Times New Roman" w:hAnsi="Times New Roman" w:cs="Times New Roman"/>
+          <w:b/>
+          <w:szCs w:val="21"/>
+        </w:rPr>
+        <w:t xml:space="preserve">Sacred Heart University </w:t>
+      </w:r>
+      <w:r>
+        <w:rPr>
+          <w:rFonts w:ascii="Times New Roman" w:hAnsi="Times New Roman" w:cs="Times New Roman"/>
+          <w:bCs/>
+          <w:szCs w:val="21"/>
+        </w:rPr>
+        <w:t xml:space="preserve">| Digital Strategy Intern </w:t>
+      </w:r>
+      <w:r>
+        <w:rPr>
+          <w:rFonts w:ascii="Times New Roman" w:hAnsi="Times New Roman" w:cs="Times New Roman"/>
+          <w:bCs/>
+          <w:i/>
+          <w:iCs/>
+          <w:szCs w:val="21"/>
+        </w:rPr>
+        <w:t>(</w:t>
+      </w:r>
+      <w:r>
+        <w:rPr>
+          <w:rFonts w:ascii="Times New Roman" w:hAnsi="Times New Roman" w:cs="Times New Roman"/>
+          <w:bCs/>
+          <w:i/>
+          <w:iCs/>
+          <w:szCs w:val="21"/>
+        </w:rPr>
+        <w:t xml:space="preserve">May-August </w:t>
+      </w:r>
+      <w:r>
+        <w:rPr>
+          <w:rFonts w:ascii="Times New Roman" w:hAnsi="Times New Roman" w:cs="Times New Roman"/>
+          <w:bCs/>
+          <w:i/>
+          <w:iCs/>
+          <w:szCs w:val="21"/>
+        </w:rPr>
+        <w:t>2026)</w:t>
+      </w:r>
     </w:p>
     <w:p>
       <w:pPr>
+        <w:pStyle w:val="ListParagraph"/>
+        <w:numPr>
+          <w:ilvl w:val="0"/>
+          <w:numId w:val="34"/>
+        </w:numPr>
+        <w:spacing w:line="240" w:lineRule="auto"/>
+        <w:jc w:val="left"/>
+        <w:rPr>
+          <w:bCs/>
+          <w:sz w:val="22"/>
+          <w:szCs w:val="22"/>
+        </w:rPr>
+      </w:pPr>
+      <w:r>
+        <w:rPr>
+          <w:bCs/>
+          <w:sz w:val="22"/>
+          <w:szCs w:val="22"/>
+        </w:rPr>
+        <w:t xml:space="preserve">Developed and maintained university web content using </w:t>
+      </w:r>
+      <w:proofErr w:type="spellStart"/>
+      <w:r>
+        <w:rPr>
+          <w:bCs/>
+          <w:sz w:val="22"/>
+          <w:szCs w:val="22"/>
+        </w:rPr>
+        <w:t>TerminalFour</w:t>
+      </w:r>
+      <w:proofErr w:type="spellEnd"/>
+      <w:r>
+        <w:rPr>
+          <w:bCs/>
+          <w:sz w:val="22"/>
+          <w:szCs w:val="22"/>
+        </w:rPr>
+        <w:t xml:space="preserve"> CMS, HTML/CSS, and</w:t>
+      </w:r>
+      <w:r>
+        <w:rPr>
+          <w:bCs/>
+          <w:sz w:val="22"/>
+          <w:szCs w:val="22"/>
+        </w:rPr>
+        <w:t xml:space="preserve"> </w:t>
+      </w:r>
+      <w:proofErr w:type="spellStart"/>
+      <w:r>
+        <w:rPr>
+          <w:bCs/>
+          <w:sz w:val="22"/>
+          <w:szCs w:val="22"/>
+        </w:rPr>
+        <w:t>DubBot</w:t>
+      </w:r>
+      <w:proofErr w:type="spellEnd"/>
+      <w:r>
+        <w:rPr>
+          <w:bCs/>
+          <w:sz w:val="22"/>
+          <w:szCs w:val="22"/>
+        </w:rPr>
+        <w:t xml:space="preserve"> accessibility tooling across </w:t>
+      </w:r>
+      <w:r>
+        <w:rPr>
+          <w:bCs/>
+          <w:sz w:val="22"/>
+          <w:szCs w:val="22"/>
+        </w:rPr>
+        <w:t>7,000+</w:t>
+      </w:r>
+      <w:r>
+        <w:rPr>
+          <w:bCs/>
+          <w:sz w:val="22"/>
+          <w:szCs w:val="22"/>
+        </w:rPr>
+        <w:t xml:space="preserve"> production webpages.</w:t>
+      </w:r>
+    </w:p>
+    <w:p>
+      <w:pPr>
+        <w:pStyle w:val="ListParagraph"/>
+        <w:numPr>
+          <w:ilvl w:val="0"/>
+          <w:numId w:val="34"/>
+        </w:numPr>
+        <w:spacing w:line="240" w:lineRule="auto"/>
+        <w:jc w:val="left"/>
+        <w:rPr>
+          <w:bCs/>
+          <w:sz w:val="22"/>
+          <w:szCs w:val="22"/>
+        </w:rPr>
+      </w:pPr>
+      <w:r>
+        <w:rPr>
+          <w:bCs/>
+          <w:sz w:val="22"/>
+          <w:szCs w:val="22"/>
+        </w:rPr>
+        <w:t>Audited</w:t>
+      </w:r>
+      <w:r>
+        <w:rPr>
+          <w:bCs/>
+          <w:sz w:val="22"/>
+          <w:szCs w:val="22"/>
+        </w:rPr>
+        <w:t xml:space="preserve"> web content </w:t>
+      </w:r>
+      <w:r>
+        <w:rPr>
+          <w:bCs/>
+          <w:sz w:val="22"/>
+          <w:szCs w:val="22"/>
+        </w:rPr>
+        <w:t>for</w:t>
+      </w:r>
+      <w:r>
+        <w:rPr>
+          <w:bCs/>
+          <w:sz w:val="22"/>
+          <w:szCs w:val="22"/>
+        </w:rPr>
+        <w:t xml:space="preserve"> WCAG/ADA accessibility standards and </w:t>
+      </w:r>
+      <w:r>
+        <w:rPr>
+          <w:bCs/>
+          <w:sz w:val="22"/>
+          <w:szCs w:val="22"/>
+        </w:rPr>
+        <w:t>fixed</w:t>
+      </w:r>
+      <w:r>
+        <w:rPr>
+          <w:bCs/>
+          <w:sz w:val="22"/>
+          <w:szCs w:val="22"/>
+        </w:rPr>
+        <w:t xml:space="preserve"> compliance issues across</w:t>
+      </w:r>
+      <w:r>
+        <w:rPr>
+          <w:bCs/>
+          <w:sz w:val="22"/>
+          <w:szCs w:val="22"/>
+        </w:rPr>
+        <w:t xml:space="preserve"> </w:t>
+      </w:r>
+      <w:r>
+        <w:rPr>
+          <w:bCs/>
+          <w:sz w:val="22"/>
+          <w:szCs w:val="22"/>
+        </w:rPr>
+        <w:t>university</w:t>
+      </w:r>
+      <w:r>
+        <w:rPr>
+          <w:bCs/>
+          <w:sz w:val="22"/>
+          <w:szCs w:val="22"/>
+        </w:rPr>
+        <w:t xml:space="preserve"> </w:t>
+      </w:r>
+      <w:r>
+        <w:rPr>
+          <w:bCs/>
+          <w:sz w:val="22"/>
+          <w:szCs w:val="22"/>
+        </w:rPr>
+        <w:t>pages</w:t>
+      </w:r>
+    </w:p>
+    <w:p>
+      <w:pPr>
+        <w:pStyle w:val="ListParagraph"/>
+        <w:numPr>
+          <w:ilvl w:val="0"/>
+          <w:numId w:val="34"/>
+        </w:numPr>
+        <w:spacing w:line="240" w:lineRule="auto"/>
+        <w:jc w:val="left"/>
+        <w:rPr>
+          <w:bCs/>
+          <w:sz w:val="22"/>
+          <w:szCs w:val="22"/>
+        </w:rPr>
+      </w:pPr>
+      <w:r>
+        <w:rPr>
+          <w:bCs/>
+          <w:sz w:val="22"/>
+          <w:szCs w:val="22"/>
+        </w:rPr>
+        <w:t xml:space="preserve">Researched content </w:t>
+      </w:r>
+      <w:r>
+        <w:rPr>
+          <w:bCs/>
+          <w:sz w:val="22"/>
+          <w:szCs w:val="22"/>
+        </w:rPr>
+        <w:t xml:space="preserve">management solutions </w:t>
+      </w:r>
+      <w:r>
+        <w:rPr>
+          <w:bCs/>
+          <w:sz w:val="22"/>
+          <w:szCs w:val="22"/>
+        </w:rPr>
+        <w:t xml:space="preserve">and </w:t>
+      </w:r>
+      <w:r>
+        <w:rPr>
+          <w:bCs/>
+          <w:sz w:val="22"/>
+          <w:szCs w:val="22"/>
+        </w:rPr>
+        <w:t>engaged with</w:t>
+      </w:r>
+      <w:r>
+        <w:rPr>
+          <w:bCs/>
+          <w:sz w:val="22"/>
+          <w:szCs w:val="22"/>
+        </w:rPr>
+        <w:t xml:space="preserve"> </w:t>
+      </w:r>
+      <w:r>
+        <w:rPr>
+          <w:bCs/>
+          <w:sz w:val="22"/>
+          <w:szCs w:val="22"/>
+        </w:rPr>
+        <w:t>vendors to c</w:t>
+      </w:r>
+      <w:r>
+        <w:rPr>
+          <w:bCs/>
+          <w:sz w:val="22"/>
+          <w:szCs w:val="22"/>
+        </w:rPr>
+        <w:t xml:space="preserve">oordinate </w:t>
+      </w:r>
+      <w:r>
+        <w:rPr>
+          <w:bCs/>
+          <w:sz w:val="22"/>
+          <w:szCs w:val="22"/>
+        </w:rPr>
+        <w:t xml:space="preserve">product demonstrations </w:t>
+      </w:r>
+    </w:p>
+    <w:p>
+      <w:pPr>
         <w:pStyle w:val="NoSpacing"/>
+        <w:rPr>
+          <w:rFonts w:ascii="Times New Roman" w:hAnsi="Times New Roman" w:cs="Times New Roman"/>
+          <w:bCs/>
+        </w:rPr>
+      </w:pPr>
+      <w:proofErr w:type="spellStart"/>
+      <w:r>
+        <w:rPr>
+          <w:rFonts w:ascii="Times New Roman" w:hAnsi="Times New Roman" w:cs="Times New Roman"/>
+          <w:b/>
+        </w:rPr>
+        <w:t>SmartGPA</w:t>
+      </w:r>
+      <w:proofErr w:type="spellEnd"/>
+      <w:r>
+        <w:rPr>
+          <w:rFonts w:ascii="Times New Roman" w:hAnsi="Times New Roman" w:cs="Times New Roman"/>
+          <w:b/>
+        </w:rPr>
+        <w:t xml:space="preserve"> </w:t>
+      </w:r>
+      <w:r>
+        <w:rPr>
+          <w:rFonts w:ascii="Times New Roman" w:hAnsi="Times New Roman" w:cs="Times New Roman"/>
+          <w:bCs/>
+        </w:rPr>
+        <w:t xml:space="preserve">| Co-Creator </w:t>
+      </w:r>
+      <w:r>
         <w:rPr>
           <w:rFonts w:ascii="Times New Roman" w:hAnsi="Times New Roman" w:cs="Times New Roman"/>
           <w:bCs/>
           <w:i/>
           <w:iCs/>
         </w:rPr>
-      </w:pPr>
-      <w:r>
-        <w:rPr>
-          <w:rFonts w:ascii="Times New Roman" w:hAnsi="Times New Roman" w:cs="Times New Roman"/>
-          <w:b/>
-        </w:rPr>
-        <w:t xml:space="preserve">SmartGPA </w:t>
-      </w:r>
-      <w:r>
-        <w:rPr>
-          <w:rFonts w:ascii="Times New Roman" w:hAnsi="Times New Roman" w:cs="Times New Roman"/>
-          <w:bCs/>
-        </w:rPr>
-        <w:t xml:space="preserve">| Co-Creator </w:t>
-      </w:r>
-      <w:r>
-        <w:rPr>
-          <w:rFonts w:ascii="Times New Roman" w:hAnsi="Times New Roman" w:cs="Times New Roman"/>
-          <w:bCs/>
-          <w:i/>
-          <w:iCs/>
-        </w:rPr>
         <w:t>(2026)</w:t>
+      </w:r>
+      <w:r>
+        <w:rPr>
+          <w:rFonts w:ascii="Times New Roman" w:hAnsi="Times New Roman" w:cs="Times New Roman"/>
+          <w:bCs/>
+        </w:rPr>
+        <w:t xml:space="preserve"> | </w:t>
+      </w:r>
+      <w:hyperlink r:id="rId12" w:history="1">
+        <w:r>
+          <w:rPr>
+            <w:rStyle w:val="Hyperlink"/>
+            <w:rFonts w:ascii="Times New Roman" w:hAnsi="Times New Roman" w:cs="Times New Roman"/>
+            <w:bCs/>
+          </w:rPr>
+          <w:t>https://smartgpa.onrender.com/</w:t>
+        </w:r>
+      </w:hyperlink>
+      <w:r>
+        <w:rPr>
+          <w:rFonts w:ascii="Times New Roman" w:hAnsi="Times New Roman" w:cs="Times New Roman"/>
+          <w:bCs/>
+        </w:rPr>
+        <w:t xml:space="preserve"> </w:t>
       </w:r>
     </w:p>
     <w:p>
@@ -742,7 +951,21 @@
           <w:rFonts w:ascii="Times New Roman" w:hAnsi="Times New Roman" w:cs="Times New Roman"/>
           <w:bCs/>
         </w:rPr>
-        <w:t>Developed a full‑stack GPA tracking platform using Flask, PostgreSQL, JavaScript, and HTML/CSS, enabling users to calculate and store academic performance data</w:t>
+        <w:t>Engineered a full</w:t>
+      </w:r>
+      <w:r>
+        <w:rPr>
+          <w:rFonts w:ascii="Times New Roman" w:hAnsi="Times New Roman" w:cs="Times New Roman"/>
+          <w:bCs/>
+        </w:rPr>
+        <w:t>-</w:t>
+      </w:r>
+      <w:r>
+        <w:rPr>
+          <w:rFonts w:ascii="Times New Roman" w:hAnsi="Times New Roman" w:cs="Times New Roman"/>
+          <w:bCs/>
+        </w:rPr>
+        <w:t>stack academic analytics platform using Flask, PostgreSQL, JavaScript, and HTML/CSS with persistent user accounts and multi-semester GPA tracking.</w:t>
       </w:r>
     </w:p>
     <w:p>
@@ -789,7 +1012,21 @@
           <w:rFonts w:ascii="Times New Roman" w:hAnsi="Times New Roman" w:cs="Times New Roman"/>
           <w:bCs/>
         </w:rPr>
-        <w:t xml:space="preserve">Implemented secure authentication </w:t>
+        <w:t xml:space="preserve">Implemented secure </w:t>
+      </w:r>
+      <w:r>
+        <w:rPr>
+          <w:rFonts w:ascii="Times New Roman" w:hAnsi="Times New Roman" w:cs="Times New Roman"/>
+          <w:bCs/>
+        </w:rPr>
+        <w:t xml:space="preserve">server-side </w:t>
+      </w:r>
+      <w:r>
+        <w:rPr>
+          <w:rFonts w:ascii="Times New Roman" w:hAnsi="Times New Roman" w:cs="Times New Roman"/>
+          <w:bCs/>
+        </w:rPr>
+        <w:t xml:space="preserve">authentication </w:t>
       </w:r>
       <w:r>
         <w:rPr>
@@ -810,7 +1047,21 @@
           <w:rFonts w:ascii="Times New Roman" w:hAnsi="Times New Roman" w:cs="Times New Roman"/>
           <w:bCs/>
         </w:rPr>
-        <w:t>to protect user data</w:t>
+        <w:t xml:space="preserve">to protect </w:t>
+      </w:r>
+      <w:r>
+        <w:rPr>
+          <w:rFonts w:ascii="Times New Roman" w:hAnsi="Times New Roman" w:cs="Times New Roman"/>
+          <w:bCs/>
+        </w:rPr>
+        <w:t>academic</w:t>
+      </w:r>
+      <w:r>
+        <w:rPr>
+          <w:rFonts w:ascii="Times New Roman" w:hAnsi="Times New Roman" w:cs="Times New Roman"/>
+          <w:bCs/>
+        </w:rPr>
+        <w:t xml:space="preserve"> data</w:t>
       </w:r>
     </w:p>
     <w:p>
@@ -830,21 +1081,58 @@
           <w:rFonts w:ascii="Times New Roman" w:hAnsi="Times New Roman" w:cs="Times New Roman"/>
           <w:bCs/>
         </w:rPr>
-        <w:t xml:space="preserve">Developed an AI‑powered syllabus scanner that automatically extracts </w:t>
-      </w:r>
-      <w:r>
-        <w:rPr>
-          <w:rFonts w:ascii="Times New Roman" w:hAnsi="Times New Roman" w:cs="Times New Roman"/>
-          <w:bCs/>
-        </w:rPr>
-        <w:t xml:space="preserve">data </w:t>
-      </w:r>
-      <w:r>
-        <w:rPr>
-          <w:rFonts w:ascii="Times New Roman" w:hAnsi="Times New Roman" w:cs="Times New Roman"/>
-          <w:bCs/>
-        </w:rPr>
-        <w:t>from uploaded files</w:t>
+        <w:t>Developed</w:t>
+      </w:r>
+      <w:r>
+        <w:rPr>
+          <w:rFonts w:ascii="Times New Roman" w:hAnsi="Times New Roman" w:cs="Times New Roman"/>
+          <w:bCs/>
+        </w:rPr>
+        <w:t xml:space="preserve"> an AI‑powered syllabus scanner </w:t>
+      </w:r>
+      <w:r>
+        <w:rPr>
+          <w:rFonts w:ascii="Times New Roman" w:hAnsi="Times New Roman" w:cs="Times New Roman"/>
+          <w:bCs/>
+        </w:rPr>
+        <w:t xml:space="preserve">using </w:t>
+      </w:r>
+      <w:r>
+        <w:rPr>
+          <w:rFonts w:ascii="Times New Roman" w:hAnsi="Times New Roman" w:cs="Times New Roman"/>
+          <w:bCs/>
+        </w:rPr>
+        <w:t xml:space="preserve">the </w:t>
+      </w:r>
+      <w:proofErr w:type="spellStart"/>
+      <w:r>
+        <w:rPr>
+          <w:rFonts w:ascii="Times New Roman" w:hAnsi="Times New Roman" w:cs="Times New Roman"/>
+          <w:bCs/>
+        </w:rPr>
+        <w:t>Groq</w:t>
+      </w:r>
+      <w:proofErr w:type="spellEnd"/>
+      <w:r>
+        <w:rPr>
+          <w:rFonts w:ascii="Times New Roman" w:hAnsi="Times New Roman" w:cs="Times New Roman"/>
+          <w:bCs/>
+        </w:rPr>
+        <w:t xml:space="preserve"> API</w:t>
+      </w:r>
+      <w:r>
+        <w:rPr>
+          <w:rFonts w:ascii="Times New Roman" w:hAnsi="Times New Roman" w:cs="Times New Roman"/>
+          <w:bCs/>
+        </w:rPr>
+        <w:t xml:space="preserve"> </w:t>
+      </w:r>
+      <w:r>
+        <w:rPr>
+          <w:rFonts w:ascii="Times New Roman" w:hAnsi="Times New Roman" w:cs="Times New Roman"/>
+          <w:bCs/>
+        </w:rPr>
+        <w:t>to convert syllabi to structured assignment data.</w:t>
       </w:r>
     </w:p>
     <w:p>
@@ -852,15 +1140,6 @@
         <w:pStyle w:val="NoSpacing"/>
         <w:rPr>
           <w:rFonts w:ascii="Times New Roman" w:hAnsi="Times New Roman" w:cs="Times New Roman"/>
-          <w:bCs/>
-        </w:rPr>
-      </w:pPr>
-    </w:p>
-    <w:p>
-      <w:pPr>
-        <w:pStyle w:val="NoSpacing"/>
-        <w:rPr>
-          <w:rFonts w:ascii="Times New Roman" w:hAnsi="Times New Roman" w:cs="Times New Roman"/>
           <w:szCs w:val="21"/>
         </w:rPr>
       </w:pPr>
@@ -887,6 +1166,30 @@
         </w:rPr>
         <w:t>(2024)</w:t>
       </w:r>
+      <w:r>
+        <w:rPr>
+          <w:rFonts w:ascii="Times New Roman" w:hAnsi="Times New Roman" w:cs="Times New Roman"/>
+          <w:b/>
+        </w:rPr>
+        <w:t xml:space="preserve"> </w:t>
+      </w:r>
+      <w:r>
+        <w:rPr>
+          <w:rFonts w:ascii="Times New Roman" w:hAnsi="Times New Roman" w:cs="Times New Roman"/>
+          <w:b/>
+        </w:rPr>
+        <w:t xml:space="preserve">| </w:t>
+      </w:r>
+      <w:hyperlink r:id="rId13" w:history="1">
+        <w:r>
+          <w:rPr>
+            <w:rStyle w:val="Hyperlink"/>
+            <w:rFonts w:ascii="Times New Roman" w:hAnsi="Times New Roman" w:cs="Times New Roman"/>
+            <w:bCs/>
+          </w:rPr>
+          <w:t>https://rriccio.netlify.app/</w:t>
+        </w:r>
+      </w:hyperlink>
       <w:r>
         <w:rPr>
           <w:rFonts w:ascii="Times New Roman" w:hAnsi="Times New Roman" w:cs="Times New Roman"/>
@@ -903,15 +1206,16 @@
           <w:numId w:val="31"/>
         </w:numPr>
         <w:rPr>
-          <w:bCs/>
-        </w:rPr>
-      </w:pPr>
-      <w:r>
-        <w:rPr>
-          <w:rFonts w:ascii="Times New Roman" w:hAnsi="Times New Roman" w:cs="Times New Roman"/>
-          <w:bCs/>
-        </w:rPr>
-        <w:t>Developed responsive personal website using HTML, CSS, JavaScript</w:t>
+          <w:rFonts w:ascii="Times New Roman" w:hAnsi="Times New Roman" w:cs="Times New Roman"/>
+          <w:bCs/>
+        </w:rPr>
+      </w:pPr>
+      <w:r>
+        <w:rPr>
+          <w:rFonts w:ascii="Times New Roman" w:hAnsi="Times New Roman" w:cs="Times New Roman"/>
+          <w:bCs/>
+        </w:rPr>
+        <w:t>Developed and deployed a responsive personal portfolio using JavaScript, HTML, and CSS to showcase software projects, technical experience, and academic work</w:t>
       </w:r>
     </w:p>
     <w:p>
@@ -931,21 +1235,21 @@
           <w:rFonts w:ascii="Times New Roman" w:hAnsi="Times New Roman" w:cs="Times New Roman"/>
           <w:bCs/>
         </w:rPr>
-        <w:t xml:space="preserve">Integrated dynamic </w:t>
-      </w:r>
-      <w:r>
-        <w:rPr>
-          <w:rFonts w:ascii="Times New Roman" w:hAnsi="Times New Roman" w:cs="Times New Roman"/>
-          <w:bCs/>
-        </w:rPr>
-        <w:t xml:space="preserve">coding </w:t>
-      </w:r>
-      <w:r>
-        <w:rPr>
-          <w:rFonts w:ascii="Times New Roman" w:hAnsi="Times New Roman" w:cs="Times New Roman"/>
-          <w:bCs/>
-        </w:rPr>
-        <w:t xml:space="preserve">project showcases and </w:t>
+        <w:t xml:space="preserve">Integrated </w:t>
+      </w:r>
+      <w:r>
+        <w:rPr>
+          <w:rFonts w:ascii="Times New Roman" w:hAnsi="Times New Roman" w:cs="Times New Roman"/>
+          <w:bCs/>
+        </w:rPr>
+        <w:t xml:space="preserve">10+ </w:t>
+      </w:r>
+      <w:r>
+        <w:rPr>
+          <w:rFonts w:ascii="Times New Roman" w:hAnsi="Times New Roman" w:cs="Times New Roman"/>
+          <w:bCs/>
+        </w:rPr>
+        <w:t xml:space="preserve">dynamic project showcases and </w:t>
       </w:r>
       <w:r>
         <w:rPr>
@@ -959,125 +1263,105 @@
           <w:rFonts w:ascii="Times New Roman" w:hAnsi="Times New Roman" w:cs="Times New Roman"/>
           <w:bCs/>
         </w:rPr>
-        <w:t>scheduling tools</w:t>
+        <w:t xml:space="preserve">scheduling </w:t>
+      </w:r>
+      <w:r>
+        <w:rPr>
+          <w:rFonts w:ascii="Times New Roman" w:hAnsi="Times New Roman" w:cs="Times New Roman"/>
+          <w:bCs/>
+        </w:rPr>
+        <w:t>tools</w:t>
       </w:r>
     </w:p>
     <w:p>
       <w:pPr>
         <w:pStyle w:val="NoSpacing"/>
-        <w:numPr>
-          <w:ilvl w:val="0"/>
-          <w:numId w:val="31"/>
-        </w:numPr>
-        <w:rPr>
-          <w:rFonts w:ascii="Times New Roman" w:hAnsi="Times New Roman" w:cs="Times New Roman"/>
-          <w:bCs/>
-        </w:rPr>
-      </w:pPr>
-      <w:r>
-        <w:rPr>
-          <w:rFonts w:ascii="Times New Roman" w:hAnsi="Times New Roman" w:cs="Times New Roman"/>
-          <w:bCs/>
-        </w:rPr>
-        <w:t xml:space="preserve">Deployed </w:t>
-      </w:r>
-      <w:r>
-        <w:rPr>
-          <w:rFonts w:ascii="Times New Roman" w:hAnsi="Times New Roman" w:cs="Times New Roman"/>
-          <w:bCs/>
-        </w:rPr>
-        <w:t>from Netlify</w:t>
-      </w:r>
-      <w:r>
-        <w:rPr>
-          <w:rFonts w:ascii="Times New Roman" w:hAnsi="Times New Roman" w:cs="Times New Roman"/>
-          <w:bCs/>
-        </w:rPr>
-        <w:t xml:space="preserve">, connected to GitHub </w:t>
-      </w:r>
-      <w:r>
-        <w:rPr>
-          <w:rFonts w:ascii="Times New Roman" w:hAnsi="Times New Roman" w:cs="Times New Roman"/>
-          <w:bCs/>
-        </w:rPr>
-        <w:t xml:space="preserve">for continuous </w:t>
-      </w:r>
-      <w:r>
-        <w:rPr>
-          <w:rFonts w:ascii="Times New Roman" w:hAnsi="Times New Roman" w:cs="Times New Roman"/>
-          <w:bCs/>
-        </w:rPr>
-        <w:t>updates</w:t>
-      </w:r>
-      <w:r>
-        <w:rPr>
-          <w:rFonts w:ascii="Times New Roman" w:hAnsi="Times New Roman" w:cs="Times New Roman"/>
-          <w:bCs/>
+        <w:rPr>
+          <w:rFonts w:ascii="Times New Roman" w:hAnsi="Times New Roman" w:cs="Times New Roman"/>
+          <w:szCs w:val="21"/>
+        </w:rPr>
+      </w:pPr>
+      <w:proofErr w:type="spellStart"/>
+      <w:r>
+        <w:rPr>
+          <w:rFonts w:ascii="Times New Roman" w:hAnsi="Times New Roman" w:cs="Times New Roman"/>
+          <w:b/>
+          <w:bCs/>
+          <w:szCs w:val="21"/>
+        </w:rPr>
+        <w:t>SimplesTerms</w:t>
+      </w:r>
+      <w:proofErr w:type="spellEnd"/>
+      <w:r>
+        <w:rPr>
+          <w:rFonts w:ascii="Times New Roman" w:hAnsi="Times New Roman" w:cs="Times New Roman"/>
+          <w:b/>
+          <w:bCs/>
+          <w:szCs w:val="21"/>
+        </w:rPr>
+        <w:t xml:space="preserve"> (Idea Challenge </w:t>
+      </w:r>
+      <w:r>
+        <w:rPr>
+          <w:rFonts w:ascii="Times New Roman" w:hAnsi="Times New Roman" w:cs="Times New Roman"/>
+          <w:b/>
+          <w:bCs/>
+          <w:szCs w:val="21"/>
+        </w:rPr>
+        <w:t>-</w:t>
+      </w:r>
+      <w:r>
+        <w:rPr>
+          <w:rFonts w:ascii="Times New Roman" w:hAnsi="Times New Roman" w:cs="Times New Roman"/>
+          <w:b/>
+          <w:bCs/>
+          <w:szCs w:val="21"/>
+        </w:rPr>
+        <w:t xml:space="preserve"> 1</w:t>
+      </w:r>
+      <w:r>
+        <w:rPr>
+          <w:rFonts w:ascii="Times New Roman" w:hAnsi="Times New Roman" w:cs="Times New Roman"/>
+          <w:b/>
+          <w:bCs/>
+          <w:szCs w:val="21"/>
+          <w:vertAlign w:val="superscript"/>
+        </w:rPr>
+        <w:t>st</w:t>
+      </w:r>
+      <w:r>
+        <w:rPr>
+          <w:rFonts w:ascii="Times New Roman" w:hAnsi="Times New Roman" w:cs="Times New Roman"/>
+          <w:b/>
+          <w:bCs/>
+          <w:szCs w:val="21"/>
+        </w:rPr>
+        <w:t xml:space="preserve"> Place) | </w:t>
+      </w:r>
+      <w:r>
+        <w:rPr>
+          <w:rFonts w:ascii="Times New Roman" w:hAnsi="Times New Roman" w:cs="Times New Roman"/>
+          <w:szCs w:val="21"/>
+        </w:rPr>
+        <w:t>Co-Creator</w:t>
+      </w:r>
+      <w:r>
+        <w:rPr>
+          <w:rFonts w:ascii="Times New Roman" w:hAnsi="Times New Roman" w:cs="Times New Roman"/>
+          <w:b/>
+          <w:bCs/>
+          <w:szCs w:val="21"/>
         </w:rPr>
         <w:t xml:space="preserve"> </w:t>
       </w:r>
-    </w:p>
-    <w:p>
-      <w:pPr>
-        <w:rPr>
-          <w:sz w:val="12"/>
-          <w:szCs w:val="12"/>
-        </w:rPr>
-      </w:pPr>
-    </w:p>
-    <w:p>
-      <w:pPr>
-        <w:pStyle w:val="NoSpacing"/>
+      <w:r>
         <w:rPr>
           <w:rFonts w:ascii="Times New Roman" w:hAnsi="Times New Roman" w:cs="Times New Roman"/>
           <w:i/>
           <w:iCs/>
           <w:szCs w:val="21"/>
         </w:rPr>
-      </w:pPr>
-      <w:r>
-        <w:rPr>
-          <w:rFonts w:ascii="Times New Roman" w:hAnsi="Times New Roman" w:cs="Times New Roman"/>
-          <w:b/>
-          <w:bCs/>
-          <w:szCs w:val="21"/>
-        </w:rPr>
-        <w:t>AI Legal Document Summarizer (Idea Challenge – 1</w:t>
-      </w:r>
-      <w:r>
-        <w:rPr>
-          <w:rFonts w:ascii="Times New Roman" w:hAnsi="Times New Roman" w:cs="Times New Roman"/>
-          <w:b/>
-          <w:bCs/>
-          <w:szCs w:val="21"/>
-          <w:vertAlign w:val="superscript"/>
-        </w:rPr>
-        <w:t>st</w:t>
-      </w:r>
-      <w:r>
-        <w:rPr>
-          <w:rFonts w:ascii="Times New Roman" w:hAnsi="Times New Roman" w:cs="Times New Roman"/>
-          <w:b/>
-          <w:bCs/>
-          <w:szCs w:val="21"/>
-        </w:rPr>
-        <w:t xml:space="preserve"> Place) | </w:t>
-      </w:r>
-      <w:r>
-        <w:rPr>
-          <w:rFonts w:ascii="Times New Roman" w:hAnsi="Times New Roman" w:cs="Times New Roman"/>
-          <w:szCs w:val="21"/>
-        </w:rPr>
-        <w:t>Co-Creator</w:t>
-      </w:r>
-      <w:r>
-        <w:rPr>
-          <w:rFonts w:ascii="Times New Roman" w:hAnsi="Times New Roman" w:cs="Times New Roman"/>
-          <w:b/>
-          <w:bCs/>
-          <w:szCs w:val="21"/>
-        </w:rPr>
-        <w:t xml:space="preserve"> </w:t>
+        <w:t>(</w:t>
       </w:r>
       <w:r>
         <w:rPr>
@@ -1086,7 +1370,7 @@
           <w:iCs/>
           <w:szCs w:val="21"/>
         </w:rPr>
-        <w:t>(</w:t>
+        <w:t>202</w:t>
       </w:r>
       <w:r>
         <w:rPr>
@@ -1095,7 +1379,7 @@
           <w:iCs/>
           <w:szCs w:val="21"/>
         </w:rPr>
-        <w:t>202</w:t>
+        <w:t>3)</w:t>
       </w:r>
       <w:r>
         <w:rPr>
@@ -1104,7 +1388,24 @@
           <w:iCs/>
           <w:szCs w:val="21"/>
         </w:rPr>
-        <w:t>3)</w:t>
+        <w:t xml:space="preserve"> | </w:t>
+      </w:r>
+      <w:hyperlink r:id="rId14" w:history="1">
+        <w:r>
+          <w:rPr>
+            <w:rStyle w:val="Hyperlink"/>
+            <w:rFonts w:ascii="Times New Roman" w:hAnsi="Times New Roman" w:cs="Times New Roman"/>
+            <w:szCs w:val="21"/>
+          </w:rPr>
+          <w:t>https://github.com/ryanriccio05/SimplesTerms</w:t>
+        </w:r>
+      </w:hyperlink>
+      <w:r>
+        <w:rPr>
+          <w:rFonts w:ascii="Times New Roman" w:hAnsi="Times New Roman" w:cs="Times New Roman"/>
+          <w:szCs w:val="21"/>
+        </w:rPr>
+        <w:t xml:space="preserve"> </w:t>
       </w:r>
     </w:p>
     <w:p>
@@ -1124,21 +1425,22 @@
           <w:rFonts w:ascii="Times New Roman" w:hAnsi="Times New Roman" w:cs="Times New Roman"/>
           <w:szCs w:val="21"/>
         </w:rPr>
-        <w:t xml:space="preserve">Collaborated with a team of </w:t>
-      </w:r>
-      <w:r>
-        <w:rPr>
-          <w:rFonts w:ascii="Times New Roman" w:hAnsi="Times New Roman" w:cs="Times New Roman"/>
-          <w:szCs w:val="21"/>
-        </w:rPr>
-        <w:t xml:space="preserve">3 other </w:t>
-      </w:r>
-      <w:r>
-        <w:rPr>
-          <w:rFonts w:ascii="Times New Roman" w:hAnsi="Times New Roman" w:cs="Times New Roman"/>
-          <w:szCs w:val="21"/>
-        </w:rPr>
-        <w:t>students to plan, present, and build an award-winning project</w:t>
+        <w:t>Won 1</w:t>
+      </w:r>
+      <w:r>
+        <w:rPr>
+          <w:rFonts w:ascii="Times New Roman" w:hAnsi="Times New Roman" w:cs="Times New Roman"/>
+          <w:szCs w:val="21"/>
+          <w:vertAlign w:val="superscript"/>
+        </w:rPr>
+        <w:t>st</w:t>
+      </w:r>
+      <w:r>
+        <w:rPr>
+          <w:rFonts w:ascii="Times New Roman" w:hAnsi="Times New Roman" w:cs="Times New Roman"/>
+          <w:szCs w:val="21"/>
+        </w:rPr>
+        <w:t xml:space="preserve"> Place &amp; Crowd Choice Awards at Villanova’s 2023 Idea Challenge</w:t>
       </w:r>
     </w:p>
     <w:p>
@@ -1152,86 +1454,115 @@
           <w:rFonts w:ascii="Times New Roman" w:hAnsi="Times New Roman" w:cs="Times New Roman"/>
           <w:szCs w:val="21"/>
         </w:rPr>
-      </w:pPr>
-      <w:r>
-        <w:rPr>
-          <w:rFonts w:ascii="Times New Roman" w:hAnsi="Times New Roman" w:cs="Times New Roman"/>
-          <w:szCs w:val="21"/>
-        </w:rPr>
-        <w:t>Won 1</w:t>
-      </w:r>
-      <w:r>
-        <w:rPr>
-          <w:rFonts w:ascii="Times New Roman" w:hAnsi="Times New Roman" w:cs="Times New Roman"/>
-          <w:szCs w:val="21"/>
-          <w:vertAlign w:val="superscript"/>
-        </w:rPr>
-        <w:t>st</w:t>
-      </w:r>
-      <w:r>
-        <w:rPr>
-          <w:rFonts w:ascii="Times New Roman" w:hAnsi="Times New Roman" w:cs="Times New Roman"/>
-          <w:szCs w:val="21"/>
-        </w:rPr>
-        <w:t xml:space="preserve"> Place &amp; Crowd Choice Awards at Villanova’s 2023 Idea Challenge</w:t>
-      </w:r>
-    </w:p>
-    <w:p>
-      <w:pPr>
-        <w:pStyle w:val="NoSpacing"/>
-        <w:numPr>
-          <w:ilvl w:val="0"/>
-          <w:numId w:val="23"/>
-        </w:numPr>
-        <w:rPr>
-          <w:rFonts w:ascii="Times New Roman" w:hAnsi="Times New Roman" w:cs="Times New Roman"/>
-          <w:szCs w:val="21"/>
-        </w:rPr>
-      </w:pPr>
-      <w:r>
-        <w:rPr>
-          <w:rFonts w:ascii="Times New Roman" w:hAnsi="Times New Roman" w:cs="Times New Roman"/>
-          <w:szCs w:val="21"/>
-        </w:rPr>
-        <w:t>Built</w:t>
-      </w:r>
-      <w:r>
-        <w:rPr>
-          <w:rFonts w:ascii="Times New Roman" w:hAnsi="Times New Roman" w:cs="Times New Roman"/>
-          <w:szCs w:val="21"/>
-        </w:rPr>
-        <w:t xml:space="preserve"> functional</w:t>
-      </w:r>
-      <w:r>
-        <w:rPr>
-          <w:rFonts w:ascii="Times New Roman" w:hAnsi="Times New Roman" w:cs="Times New Roman"/>
-          <w:szCs w:val="21"/>
-        </w:rPr>
-        <w:t xml:space="preserve"> prototype using React and HuggingFace APIs to </w:t>
-      </w:r>
-      <w:r>
-        <w:rPr>
-          <w:rFonts w:ascii="Times New Roman" w:hAnsi="Times New Roman" w:cs="Times New Roman"/>
-          <w:szCs w:val="21"/>
-        </w:rPr>
-        <w:t>generate concise, accurate summaries</w:t>
-      </w:r>
-    </w:p>
-    <w:p>
-      <w:pPr>
-        <w:spacing w:after="0" w:line="240" w:lineRule="auto"/>
-        <w:rPr>
-          <w:rFonts w:ascii="Times New Roman" w:hAnsi="Times New Roman" w:cs="Times New Roman"/>
-        </w:rPr>
         <w:sectPr>
-          <w:headerReference w:type="default" r:id="rId12"/>
+          <w:headerReference w:type="default" r:id="rId15"/>
           <w:type w:val="continuous"/>
           <w:pgSz w:w="12240" w:h="15840"/>
-          <w:pgMar w:top="990" w:right="720" w:bottom="720" w:left="720" w:header="720" w:footer="720" w:gutter="0"/>
+          <w:pgMar w:top="720" w:right="720" w:bottom="720" w:left="720" w:header="720" w:footer="720" w:gutter="0"/>
           <w:cols w:space="720"/>
           <w:docGrid w:linePitch="299"/>
         </w:sectPr>
       </w:pPr>
+      <w:r>
+        <w:rPr>
+          <w:rFonts w:ascii="Times New Roman" w:hAnsi="Times New Roman" w:cs="Times New Roman"/>
+          <w:szCs w:val="21"/>
+        </w:rPr>
+        <w:t>Built</w:t>
+      </w:r>
+      <w:r>
+        <w:rPr>
+          <w:rFonts w:ascii="Times New Roman" w:hAnsi="Times New Roman" w:cs="Times New Roman"/>
+          <w:szCs w:val="21"/>
+        </w:rPr>
+        <w:t xml:space="preserve"> </w:t>
+      </w:r>
+      <w:r>
+        <w:rPr>
+          <w:rFonts w:ascii="Times New Roman" w:hAnsi="Times New Roman" w:cs="Times New Roman"/>
+          <w:szCs w:val="21"/>
+        </w:rPr>
+        <w:t xml:space="preserve">a React-based </w:t>
+      </w:r>
+      <w:r>
+        <w:rPr>
+          <w:rFonts w:ascii="Times New Roman" w:hAnsi="Times New Roman" w:cs="Times New Roman"/>
+          <w:szCs w:val="21"/>
+        </w:rPr>
+        <w:t xml:space="preserve">prototype </w:t>
+      </w:r>
+      <w:r>
+        <w:rPr>
+          <w:rFonts w:ascii="Times New Roman" w:hAnsi="Times New Roman" w:cs="Times New Roman"/>
+          <w:szCs w:val="21"/>
+        </w:rPr>
+        <w:t>integrating</w:t>
+      </w:r>
+      <w:r>
+        <w:rPr>
+          <w:rFonts w:ascii="Times New Roman" w:hAnsi="Times New Roman" w:cs="Times New Roman"/>
+          <w:szCs w:val="21"/>
+        </w:rPr>
+        <w:t xml:space="preserve"> </w:t>
+      </w:r>
+      <w:proofErr w:type="spellStart"/>
+      <w:r>
+        <w:rPr>
+          <w:rFonts w:ascii="Times New Roman" w:hAnsi="Times New Roman" w:cs="Times New Roman"/>
+          <w:szCs w:val="21"/>
+        </w:rPr>
+        <w:t>HuggingFace</w:t>
+      </w:r>
+      <w:proofErr w:type="spellEnd"/>
+      <w:r>
+        <w:rPr>
+          <w:rFonts w:ascii="Times New Roman" w:hAnsi="Times New Roman" w:cs="Times New Roman"/>
+          <w:szCs w:val="21"/>
+        </w:rPr>
+        <w:t xml:space="preserve"> APIs to </w:t>
+      </w:r>
+      <w:r>
+        <w:rPr>
+          <w:rFonts w:ascii="Times New Roman" w:hAnsi="Times New Roman" w:cs="Times New Roman"/>
+          <w:szCs w:val="21"/>
+        </w:rPr>
+        <w:t xml:space="preserve">generate concise, </w:t>
+      </w:r>
+      <w:r>
+        <w:rPr>
+          <w:rFonts w:ascii="Times New Roman" w:hAnsi="Times New Roman" w:cs="Times New Roman"/>
+          <w:szCs w:val="21"/>
+        </w:rPr>
+        <w:t>AI-powered</w:t>
+      </w:r>
+      <w:r>
+        <w:rPr>
+          <w:rFonts w:ascii="Times New Roman" w:hAnsi="Times New Roman" w:cs="Times New Roman"/>
+          <w:szCs w:val="21"/>
+        </w:rPr>
+        <w:t xml:space="preserve"> summarie</w:t>
+      </w:r>
+      <w:r>
+        <w:rPr>
+          <w:rFonts w:ascii="Times New Roman" w:hAnsi="Times New Roman" w:cs="Times New Roman"/>
+          <w:szCs w:val="21"/>
+        </w:rPr>
+        <w:t xml:space="preserve">s of </w:t>
+      </w:r>
+      <w:r>
+        <w:rPr>
+          <w:rFonts w:ascii="Times New Roman" w:hAnsi="Times New Roman" w:cs="Times New Roman"/>
+          <w:szCs w:val="21"/>
+        </w:rPr>
+        <w:t>complex l</w:t>
+      </w:r>
+      <w:r>
+        <w:rPr>
+          <w:rFonts w:ascii="Times New Roman" w:hAnsi="Times New Roman" w:cs="Times New Roman"/>
+          <w:szCs w:val="21"/>
+        </w:rPr>
+        <w:t>egal documents</w:t>
+      </w:r>
     </w:p>
     <w:p>
       <w:pPr>
@@ -1245,80 +1576,151 @@
           <w:szCs w:val="12"/>
         </w:rPr>
       </w:pPr>
-      <w:r>
+    </w:p>
+    <w:p>
+      <w:pPr>
+        <w:spacing w:after="0" w:line="240" w:lineRule="auto"/>
         <w:rPr>
           <w:rFonts w:ascii="Times New Roman" w:hAnsi="Times New Roman" w:cs="Times New Roman"/>
           <w:sz w:val="10"/>
           <w:szCs w:val="8"/>
         </w:rPr>
-        <w:t xml:space="preserve"> </w:t>
-      </w:r>
+      </w:pPr>
     </w:p>
     <w:p>
       <w:pPr>
         <w:spacing w:after="0" w:line="240" w:lineRule="auto"/>
-        <w:rPr>
-          <w:rFonts w:ascii="Times New Roman" w:hAnsi="Times New Roman" w:cs="Times New Roman"/>
-          <w:sz w:val="10"/>
-          <w:szCs w:val="8"/>
-        </w:rPr>
-      </w:pPr>
+        <w:contextualSpacing/>
+        <w:rPr>
+          <w:rFonts w:ascii="Times New Roman" w:hAnsi="Times New Roman" w:cs="Times New Roman"/>
+          <w:b/>
+          <w:szCs w:val="21"/>
+        </w:rPr>
+      </w:pPr>
+      <w:r>
+        <w:rPr>
+          <w:rFonts w:ascii="Times New Roman" w:hAnsi="Times New Roman" w:cs="Times New Roman"/>
+          <w:b/>
+          <w:szCs w:val="21"/>
+        </w:rPr>
+        <w:t>OTHER</w:t>
+      </w:r>
+      <w:r>
+        <w:rPr>
+          <w:rFonts w:ascii="Times New Roman" w:hAnsi="Times New Roman" w:cs="Times New Roman"/>
+          <w:b/>
+          <w:szCs w:val="21"/>
+        </w:rPr>
+        <w:t xml:space="preserve"> </w:t>
+      </w:r>
+      <w:r>
+        <w:rPr>
+          <w:rFonts w:ascii="Times New Roman" w:hAnsi="Times New Roman" w:cs="Times New Roman"/>
+          <w:b/>
+          <w:szCs w:val="21"/>
+        </w:rPr>
+        <w:t xml:space="preserve">WORK </w:t>
+      </w:r>
+      <w:r>
+        <w:rPr>
+          <w:rFonts w:ascii="Times New Roman" w:hAnsi="Times New Roman" w:cs="Times New Roman"/>
+          <w:b/>
+          <w:szCs w:val="21"/>
+        </w:rPr>
+        <w:t xml:space="preserve">EXPERIENCE </w:t>
+      </w:r>
     </w:p>
     <w:p>
       <w:pPr>
         <w:spacing w:after="0" w:line="240" w:lineRule="auto"/>
-        <w:contextualSpacing/>
+        <w:rPr>
+          <w:rFonts w:ascii="Times New Roman" w:hAnsi="Times New Roman" w:cs="Times New Roman"/>
+          <w:bCs/>
+          <w:szCs w:val="21"/>
+          <w:u w:val="single"/>
+        </w:rPr>
+      </w:pPr>
+      <w:r>
         <w:rPr>
           <w:rFonts w:ascii="Times New Roman" w:hAnsi="Times New Roman" w:cs="Times New Roman"/>
           <w:b/>
           <w:szCs w:val="21"/>
         </w:rPr>
-      </w:pPr>
-      <w:r>
-        <w:rPr>
-          <w:rFonts w:ascii="Times New Roman" w:hAnsi="Times New Roman" w:cs="Times New Roman"/>
-          <w:b/>
-          <w:szCs w:val="21"/>
-        </w:rPr>
-        <w:t>EXPERIENCE &amp; LEADERSHIP</w:t>
+        <w:t>Misquamicut Fire District</w:t>
+      </w:r>
+      <w:r>
+        <w:rPr>
+          <w:rFonts w:ascii="Times New Roman" w:hAnsi="Times New Roman" w:cs="Times New Roman"/>
+          <w:bCs/>
+          <w:szCs w:val="21"/>
+        </w:rPr>
+        <w:t xml:space="preserve"> | </w:t>
+      </w:r>
+      <w:r>
+        <w:rPr>
+          <w:rFonts w:ascii="Times New Roman" w:hAnsi="Times New Roman" w:cs="Times New Roman"/>
+          <w:bCs/>
+          <w:i/>
+          <w:iCs/>
+          <w:szCs w:val="21"/>
+        </w:rPr>
+        <w:t>(2021-</w:t>
+      </w:r>
+      <w:r>
+        <w:rPr>
+          <w:rFonts w:ascii="Times New Roman" w:hAnsi="Times New Roman" w:cs="Times New Roman"/>
+          <w:bCs/>
+          <w:i/>
+          <w:iCs/>
+          <w:szCs w:val="21"/>
+        </w:rPr>
+        <w:t>2026</w:t>
+      </w:r>
+      <w:r>
+        <w:rPr>
+          <w:rFonts w:ascii="Times New Roman" w:hAnsi="Times New Roman" w:cs="Times New Roman"/>
+          <w:bCs/>
+          <w:i/>
+          <w:iCs/>
+          <w:szCs w:val="21"/>
+        </w:rPr>
+        <w:t>)</w:t>
+      </w:r>
+      <w:r>
+        <w:rPr>
+          <w:rFonts w:ascii="Times New Roman" w:hAnsi="Times New Roman" w:cs="Times New Roman"/>
+          <w:bCs/>
+          <w:szCs w:val="21"/>
+          <w:u w:val="single"/>
+        </w:rPr>
+        <w:t xml:space="preserve"> </w:t>
       </w:r>
     </w:p>
     <w:p>
       <w:pPr>
         <w:spacing w:after="0" w:line="240" w:lineRule="auto"/>
-        <w:contextualSpacing/>
-        <w:rPr>
-          <w:rFonts w:ascii="Times New Roman" w:hAnsi="Times New Roman" w:cs="Times New Roman"/>
-          <w:b/>
-          <w:sz w:val="12"/>
-          <w:szCs w:val="12"/>
-        </w:rPr>
-      </w:pPr>
-    </w:p>
-    <w:p>
-      <w:pPr>
-        <w:spacing w:after="0" w:line="240" w:lineRule="auto"/>
-        <w:rPr>
-          <w:rFonts w:ascii="Times New Roman" w:hAnsi="Times New Roman" w:cs="Times New Roman"/>
-          <w:bCs/>
-          <w:szCs w:val="21"/>
-        </w:rPr>
-      </w:pPr>
-      <w:r>
-        <w:rPr>
-          <w:rFonts w:ascii="Times New Roman" w:hAnsi="Times New Roman" w:cs="Times New Roman"/>
-          <w:b/>
-          <w:szCs w:val="21"/>
-        </w:rPr>
-        <w:t>Lambda Chi Alpha</w:t>
-      </w:r>
-      <w:r>
-        <w:rPr>
-          <w:rFonts w:ascii="Times New Roman" w:hAnsi="Times New Roman" w:cs="Times New Roman"/>
-          <w:bCs/>
-          <w:szCs w:val="21"/>
-        </w:rPr>
-        <w:t xml:space="preserve"> | Member, High Kappa Chair </w:t>
+        <w:rPr>
+          <w:rFonts w:ascii="Times New Roman" w:hAnsi="Times New Roman" w:cs="Times New Roman"/>
+          <w:bCs/>
+          <w:szCs w:val="21"/>
+        </w:rPr>
+      </w:pPr>
+      <w:r>
+        <w:rPr>
+          <w:rFonts w:ascii="Times New Roman" w:hAnsi="Times New Roman" w:cs="Times New Roman"/>
+          <w:bCs/>
+          <w:szCs w:val="21"/>
+          <w:u w:val="single"/>
+        </w:rPr>
+        <w:t>Beach Manager</w:t>
+      </w:r>
+      <w:r>
+        <w:rPr>
+          <w:rFonts w:ascii="Times New Roman" w:hAnsi="Times New Roman" w:cs="Times New Roman"/>
+          <w:bCs/>
+          <w:szCs w:val="21"/>
+        </w:rPr>
+        <w:t xml:space="preserve"> </w:t>
       </w:r>
       <w:r>
         <w:rPr>
@@ -1328,7 +1730,7 @@
           <w:iCs/>
           <w:szCs w:val="21"/>
         </w:rPr>
-        <w:t>(2023-Present)</w:t>
+        <w:t>(May-Aug 2026)</w:t>
       </w:r>
     </w:p>
     <w:p>
@@ -1351,7 +1753,102 @@
           <w:sz w:val="22"/>
           <w:szCs w:val="22"/>
         </w:rPr>
-        <w:t>Led member onboarding program and coordinated weekly development sessions</w:t>
+        <w:t>Managed scheduling</w:t>
+      </w:r>
+      <w:r>
+        <w:rPr>
+          <w:bCs/>
+          <w:sz w:val="22"/>
+          <w:szCs w:val="22"/>
+        </w:rPr>
+        <w:t>, payroll,</w:t>
+      </w:r>
+      <w:r>
+        <w:rPr>
+          <w:bCs/>
+          <w:sz w:val="22"/>
+          <w:szCs w:val="22"/>
+        </w:rPr>
+        <w:t xml:space="preserve"> and </w:t>
+      </w:r>
+      <w:r>
+        <w:rPr>
+          <w:bCs/>
+          <w:sz w:val="22"/>
+          <w:szCs w:val="22"/>
+        </w:rPr>
+        <w:t xml:space="preserve">daily beach operations </w:t>
+      </w:r>
+      <w:r>
+        <w:rPr>
+          <w:bCs/>
+          <w:sz w:val="22"/>
+          <w:szCs w:val="22"/>
+        </w:rPr>
+        <w:t>for</w:t>
+      </w:r>
+      <w:r>
+        <w:rPr>
+          <w:bCs/>
+          <w:sz w:val="22"/>
+          <w:szCs w:val="22"/>
+        </w:rPr>
+        <w:t xml:space="preserve"> a 1</w:t>
+      </w:r>
+      <w:r>
+        <w:rPr>
+          <w:bCs/>
+          <w:sz w:val="22"/>
+          <w:szCs w:val="22"/>
+        </w:rPr>
+        <w:t>5-20</w:t>
+      </w:r>
+      <w:r>
+        <w:rPr>
+          <w:bCs/>
+          <w:sz w:val="22"/>
+          <w:szCs w:val="22"/>
+        </w:rPr>
+        <w:t xml:space="preserve"> member staff</w:t>
+      </w:r>
+    </w:p>
+    <w:p>
+      <w:pPr>
+        <w:spacing w:after="0" w:line="240" w:lineRule="auto"/>
+        <w:rPr>
+          <w:rFonts w:ascii="Times New Roman" w:hAnsi="Times New Roman" w:cs="Times New Roman"/>
+          <w:bCs/>
+          <w:i/>
+          <w:iCs/>
+          <w:szCs w:val="21"/>
+        </w:rPr>
+      </w:pPr>
+      <w:r>
+        <w:rPr>
+          <w:rFonts w:ascii="Times New Roman" w:hAnsi="Times New Roman" w:cs="Times New Roman"/>
+          <w:bCs/>
+          <w:szCs w:val="21"/>
+          <w:u w:val="single"/>
+        </w:rPr>
+        <w:t>Lifeguard Captain</w:t>
+      </w:r>
+      <w:r>
+        <w:rPr>
+          <w:rFonts w:ascii="Times New Roman" w:hAnsi="Times New Roman" w:cs="Times New Roman"/>
+          <w:bCs/>
+          <w:szCs w:val="21"/>
+        </w:rPr>
+        <w:t xml:space="preserve"> (</w:t>
+      </w:r>
+      <w:r>
+        <w:rPr>
+          <w:rFonts w:ascii="Times New Roman" w:hAnsi="Times New Roman" w:cs="Times New Roman"/>
+          <w:bCs/>
+          <w:i/>
+          <w:iCs/>
+          <w:szCs w:val="21"/>
+        </w:rPr>
+        <w:t>May 2024-Aug 2025)</w:t>
       </w:r>
     </w:p>
     <w:p>
@@ -1364,56 +1861,111 @@
         <w:spacing w:line="240" w:lineRule="auto"/>
         <w:jc w:val="left"/>
         <w:rPr>
-          <w:b/>
-          <w:szCs w:val="21"/>
-        </w:rPr>
-      </w:pPr>
-      <w:r>
-        <w:rPr>
           <w:bCs/>
           <w:sz w:val="22"/>
           <w:szCs w:val="22"/>
         </w:rPr>
-        <w:t>Organized and attended philanthropic events supporting national charities</w:t>
+      </w:pPr>
+      <w:r>
+        <w:rPr>
+          <w:bCs/>
+          <w:sz w:val="22"/>
+          <w:szCs w:val="22"/>
+        </w:rPr>
+        <w:t>Coordinated</w:t>
+      </w:r>
+      <w:r>
+        <w:rPr>
+          <w:bCs/>
+          <w:sz w:val="22"/>
+          <w:szCs w:val="22"/>
+        </w:rPr>
+        <w:t xml:space="preserve"> </w:t>
+      </w:r>
+      <w:r>
+        <w:rPr>
+          <w:bCs/>
+          <w:sz w:val="22"/>
+          <w:szCs w:val="22"/>
+        </w:rPr>
+        <w:t>lifeguard</w:t>
+      </w:r>
+      <w:r>
+        <w:rPr>
+          <w:bCs/>
+          <w:sz w:val="22"/>
+          <w:szCs w:val="22"/>
+        </w:rPr>
+        <w:t xml:space="preserve"> scheduling, </w:t>
+      </w:r>
+      <w:r>
+        <w:rPr>
+          <w:bCs/>
+          <w:sz w:val="22"/>
+          <w:szCs w:val="22"/>
+        </w:rPr>
+        <w:t xml:space="preserve">led </w:t>
+      </w:r>
+      <w:r>
+        <w:rPr>
+          <w:bCs/>
+          <w:sz w:val="22"/>
+          <w:szCs w:val="22"/>
+        </w:rPr>
+        <w:t>meetings</w:t>
+      </w:r>
+      <w:r>
+        <w:rPr>
+          <w:bCs/>
+          <w:sz w:val="22"/>
+          <w:szCs w:val="22"/>
+        </w:rPr>
+        <w:t xml:space="preserve"> and </w:t>
+      </w:r>
+      <w:r>
+        <w:rPr>
+          <w:bCs/>
+          <w:sz w:val="22"/>
+          <w:szCs w:val="22"/>
+        </w:rPr>
+        <w:t>trainin</w:t>
+      </w:r>
+      <w:r>
+        <w:rPr>
+          <w:bCs/>
+          <w:sz w:val="22"/>
+          <w:szCs w:val="22"/>
+        </w:rPr>
+        <w:t>g</w:t>
+      </w:r>
+      <w:r>
+        <w:rPr>
+          <w:bCs/>
+          <w:sz w:val="22"/>
+          <w:szCs w:val="22"/>
+        </w:rPr>
+        <w:t xml:space="preserve">, </w:t>
+      </w:r>
+      <w:r>
+        <w:rPr>
+          <w:bCs/>
+          <w:sz w:val="22"/>
+          <w:szCs w:val="22"/>
+        </w:rPr>
+        <w:t xml:space="preserve">ensured </w:t>
+      </w:r>
+      <w:r>
+        <w:rPr>
+          <w:bCs/>
+          <w:sz w:val="22"/>
+          <w:szCs w:val="22"/>
+        </w:rPr>
+        <w:t>operational readiness and safety</w:t>
       </w:r>
     </w:p>
     <w:p>
       <w:pPr>
-        <w:pStyle w:val="ListParagraph"/>
-        <w:spacing w:line="240" w:lineRule="auto"/>
-        <w:jc w:val="left"/>
-        <w:rPr>
-          <w:b/>
-          <w:szCs w:val="21"/>
-        </w:rPr>
-      </w:pPr>
-    </w:p>
-    <w:p>
-      <w:pPr>
         <w:spacing w:after="0" w:line="240" w:lineRule="auto"/>
-        <w:rPr>
-          <w:rFonts w:ascii="Times New Roman" w:hAnsi="Times New Roman" w:cs="Times New Roman"/>
-          <w:bCs/>
-          <w:szCs w:val="21"/>
-        </w:rPr>
-      </w:pPr>
-      <w:r>
-        <w:rPr>
-          <w:rFonts w:ascii="Times New Roman" w:hAnsi="Times New Roman" w:cs="Times New Roman"/>
-          <w:b/>
-          <w:szCs w:val="21"/>
-        </w:rPr>
-        <w:t>Misquamicut Fire District</w:t>
-      </w:r>
-      <w:r>
-        <w:rPr>
-          <w:rFonts w:ascii="Times New Roman" w:hAnsi="Times New Roman" w:cs="Times New Roman"/>
-          <w:bCs/>
-          <w:szCs w:val="21"/>
-        </w:rPr>
-        <w:t xml:space="preserve"> | Senior Lifeguard, Captain </w:t>
-      </w:r>
-      <w:r>
         <w:rPr>
           <w:rFonts w:ascii="Times New Roman" w:hAnsi="Times New Roman" w:cs="Times New Roman"/>
           <w:bCs/>
@@ -1421,7 +1973,33 @@
           <w:iCs/>
           <w:szCs w:val="21"/>
         </w:rPr>
-        <w:t>(2021-2025)</w:t>
+      </w:pPr>
+      <w:r>
+        <w:rPr>
+          <w:rFonts w:ascii="Times New Roman" w:hAnsi="Times New Roman" w:cs="Times New Roman"/>
+          <w:bCs/>
+          <w:szCs w:val="21"/>
+          <w:u w:val="single"/>
+        </w:rPr>
+        <w:t>Senior Lifeguard</w:t>
+      </w:r>
+      <w:r>
+        <w:rPr>
+          <w:rFonts w:ascii="Times New Roman" w:hAnsi="Times New Roman" w:cs="Times New Roman"/>
+          <w:bCs/>
+          <w:szCs w:val="21"/>
+        </w:rPr>
+        <w:t xml:space="preserve"> </w:t>
+      </w:r>
+      <w:r>
+        <w:rPr>
+          <w:rFonts w:ascii="Times New Roman" w:hAnsi="Times New Roman" w:cs="Times New Roman"/>
+          <w:bCs/>
+          <w:i/>
+          <w:iCs/>
+          <w:szCs w:val="21"/>
+        </w:rPr>
+        <w:t>(May 2021-Aug 2023)</w:t>
       </w:r>
     </w:p>
     <w:p>
@@ -1444,7 +2022,7 @@
           <w:sz w:val="22"/>
           <w:szCs w:val="22"/>
         </w:rPr>
-        <w:t xml:space="preserve">Supervised a team of 15-20 </w:t>
+        <w:t>Assisted</w:t>
       </w:r>
       <w:r>
         <w:rPr>
@@ -1452,7 +2030,130 @@
           <w:sz w:val="22"/>
           <w:szCs w:val="22"/>
         </w:rPr>
-        <w:t>beach lifeguards, managing scheduling, training, and daily operations</w:t>
+        <w:t xml:space="preserve"> emergency response operations and trained staff in CPR, water rescue, risk assessment, and prevention</w:t>
+      </w:r>
+    </w:p>
+    <w:p>
+      <w:pPr>
+        <w:pBdr>
+          <w:bottom w:val="single" w:sz="4" w:space="1" w:color="auto"/>
+        </w:pBdr>
+        <w:spacing w:line="240" w:lineRule="auto"/>
+        <w:rPr>
+          <w:rFonts w:ascii="Times New Roman" w:hAnsi="Times New Roman" w:cs="Times New Roman"/>
+          <w:b/>
+          <w:bCs/>
+          <w:sz w:val="12"/>
+          <w:szCs w:val="12"/>
+        </w:rPr>
+      </w:pPr>
+    </w:p>
+    <w:p>
+      <w:pPr>
+        <w:pStyle w:val="NoSpacing"/>
+        <w:rPr>
+          <w:rFonts w:ascii="Times New Roman" w:hAnsi="Times New Roman" w:cs="Times New Roman"/>
+          <w:b/>
+          <w:bCs/>
+        </w:rPr>
+      </w:pPr>
+      <w:r>
+        <w:rPr>
+          <w:rFonts w:ascii="Times New Roman" w:hAnsi="Times New Roman" w:cs="Times New Roman"/>
+          <w:b/>
+          <w:bCs/>
+        </w:rPr>
+        <w:t>LEADERSHIP &amp; ACTIVITIES</w:t>
+      </w:r>
+    </w:p>
+    <w:p>
+      <w:pPr>
+        <w:pStyle w:val="NoSpacing"/>
+        <w:rPr>
+          <w:rFonts w:ascii="Times New Roman" w:hAnsi="Times New Roman" w:cs="Times New Roman"/>
+          <w:b/>
+        </w:rPr>
+      </w:pPr>
+      <w:r>
+        <w:rPr>
+          <w:rFonts w:ascii="Times New Roman" w:hAnsi="Times New Roman" w:cs="Times New Roman"/>
+          <w:b/>
+        </w:rPr>
+        <w:t>Lambda Chi Alpha</w:t>
+      </w:r>
+      <w:r>
+        <w:rPr>
+          <w:rFonts w:ascii="Times New Roman" w:hAnsi="Times New Roman" w:cs="Times New Roman"/>
+        </w:rPr>
+        <w:t xml:space="preserve"> | </w:t>
+      </w:r>
+      <w:r>
+        <w:rPr>
+          <w:rFonts w:ascii="Times New Roman" w:hAnsi="Times New Roman" w:cs="Times New Roman"/>
+        </w:rPr>
+        <w:t xml:space="preserve">Member, </w:t>
+      </w:r>
+      <w:r>
+        <w:rPr>
+          <w:rFonts w:ascii="Times New Roman" w:hAnsi="Times New Roman" w:cs="Times New Roman"/>
+        </w:rPr>
+        <w:t xml:space="preserve">High Kappa </w:t>
+      </w:r>
+      <w:r>
+        <w:rPr>
+          <w:rFonts w:ascii="Times New Roman" w:hAnsi="Times New Roman" w:cs="Times New Roman"/>
+        </w:rPr>
+        <w:t>(Member Development Chair)</w:t>
+      </w:r>
+      <w:r>
+        <w:rPr>
+          <w:rFonts w:ascii="Times New Roman" w:hAnsi="Times New Roman" w:cs="Times New Roman"/>
+        </w:rPr>
+        <w:t xml:space="preserve"> </w:t>
+      </w:r>
+      <w:r>
+        <w:rPr>
+          <w:rFonts w:ascii="Times New Roman" w:hAnsi="Times New Roman" w:cs="Times New Roman"/>
+          <w:i/>
+          <w:iCs/>
+        </w:rPr>
+        <w:t>(</w:t>
+      </w:r>
+      <w:r>
+        <w:rPr>
+          <w:rFonts w:ascii="Times New Roman" w:hAnsi="Times New Roman" w:cs="Times New Roman"/>
+          <w:i/>
+          <w:iCs/>
+        </w:rPr>
+        <w:t xml:space="preserve">Sept </w:t>
+      </w:r>
+      <w:r>
+        <w:rPr>
+          <w:rFonts w:ascii="Times New Roman" w:hAnsi="Times New Roman" w:cs="Times New Roman"/>
+          <w:i/>
+          <w:iCs/>
+        </w:rPr>
+        <w:t>2023-Present)</w:t>
+      </w:r>
+    </w:p>
+    <w:p>
+      <w:pPr>
+        <w:pStyle w:val="NoSpacing"/>
+        <w:numPr>
+          <w:ilvl w:val="0"/>
+          <w:numId w:val="35"/>
+        </w:numPr>
+        <w:rPr>
+          <w:rFonts w:ascii="Times New Roman" w:hAnsi="Times New Roman" w:cs="Times New Roman"/>
+          <w:b/>
+          <w:szCs w:val="21"/>
+        </w:rPr>
+      </w:pPr>
+      <w:r>
+        <w:rPr>
+          <w:rFonts w:ascii="Times New Roman" w:hAnsi="Times New Roman" w:cs="Times New Roman"/>
+        </w:rPr>
+        <w:t>Led member onboarding program and coordinated weekly development sessions</w:t>
       </w:r>
     </w:p>
     <w:p>
@@ -1475,15 +2176,122 @@
           <w:sz w:val="22"/>
           <w:szCs w:val="22"/>
         </w:rPr>
-        <w:t xml:space="preserve">Led emergency responses and executed </w:t>
-      </w:r>
-      <w:r>
-        <w:rPr>
-          <w:bCs/>
-          <w:sz w:val="22"/>
-          <w:szCs w:val="22"/>
-        </w:rPr>
-        <w:t>many high-pressure rescue protocols</w:t>
+        <w:t>Organized and attended philanthropic events supporting national charities</w:t>
+      </w:r>
+    </w:p>
+    <w:p>
+      <w:pPr>
+        <w:spacing w:after="0" w:line="240" w:lineRule="auto"/>
+        <w:rPr>
+          <w:rFonts w:ascii="Times New Roman" w:hAnsi="Times New Roman" w:cs="Times New Roman"/>
+          <w:bCs/>
+          <w:szCs w:val="21"/>
+        </w:rPr>
+      </w:pPr>
+      <w:r>
+        <w:rPr>
+          <w:rFonts w:ascii="Times New Roman" w:hAnsi="Times New Roman" w:cs="Times New Roman"/>
+          <w:b/>
+          <w:szCs w:val="21"/>
+        </w:rPr>
+        <w:t>A Cappella</w:t>
+      </w:r>
+      <w:r>
+        <w:rPr>
+          <w:rFonts w:ascii="Times New Roman" w:hAnsi="Times New Roman" w:cs="Times New Roman"/>
+          <w:b/>
+          <w:szCs w:val="21"/>
+        </w:rPr>
+        <w:t xml:space="preserve"> </w:t>
+      </w:r>
+      <w:r>
+        <w:rPr>
+          <w:rFonts w:ascii="Times New Roman" w:hAnsi="Times New Roman" w:cs="Times New Roman"/>
+          <w:b/>
+          <w:szCs w:val="21"/>
+        </w:rPr>
+        <w:t xml:space="preserve">| </w:t>
+      </w:r>
+      <w:r>
+        <w:rPr>
+          <w:rFonts w:ascii="Times New Roman" w:hAnsi="Times New Roman" w:cs="Times New Roman"/>
+          <w:bCs/>
+          <w:szCs w:val="21"/>
+        </w:rPr>
+        <w:t xml:space="preserve">Web Developer, </w:t>
+      </w:r>
+      <w:r>
+        <w:rPr>
+          <w:rFonts w:ascii="Times New Roman" w:hAnsi="Times New Roman" w:cs="Times New Roman"/>
+          <w:bCs/>
+          <w:szCs w:val="21"/>
+        </w:rPr>
+        <w:t>Member</w:t>
+      </w:r>
+      <w:r>
+        <w:rPr>
+          <w:rFonts w:ascii="Times New Roman" w:hAnsi="Times New Roman" w:cs="Times New Roman"/>
+          <w:bCs/>
+          <w:szCs w:val="21"/>
+        </w:rPr>
+        <w:t xml:space="preserve"> </w:t>
+      </w:r>
+      <w:r>
+        <w:rPr>
+          <w:rFonts w:ascii="Times New Roman" w:hAnsi="Times New Roman" w:cs="Times New Roman"/>
+          <w:bCs/>
+          <w:i/>
+          <w:iCs/>
+          <w:szCs w:val="21"/>
+        </w:rPr>
+        <w:t>(</w:t>
+      </w:r>
+      <w:r>
+        <w:rPr>
+          <w:rFonts w:ascii="Times New Roman" w:hAnsi="Times New Roman" w:cs="Times New Roman"/>
+          <w:bCs/>
+          <w:i/>
+          <w:iCs/>
+          <w:szCs w:val="21"/>
+        </w:rPr>
+        <w:t xml:space="preserve">Sept </w:t>
+      </w:r>
+      <w:r>
+        <w:rPr>
+          <w:rFonts w:ascii="Times New Roman" w:hAnsi="Times New Roman" w:cs="Times New Roman"/>
+          <w:bCs/>
+          <w:i/>
+          <w:iCs/>
+          <w:szCs w:val="21"/>
+        </w:rPr>
+        <w:t>2023-Present)</w:t>
+      </w:r>
+      <w:r>
+        <w:rPr>
+          <w:rFonts w:ascii="Times New Roman" w:hAnsi="Times New Roman" w:cs="Times New Roman"/>
+          <w:bCs/>
+          <w:szCs w:val="21"/>
+        </w:rPr>
+        <w:t xml:space="preserve"> | </w:t>
+      </w:r>
+      <w:hyperlink r:id="rId16" w:history="1">
+        <w:r>
+          <w:rPr>
+            <w:rStyle w:val="Hyperlink"/>
+            <w:rFonts w:ascii="Times New Roman" w:hAnsi="Times New Roman" w:cs="Times New Roman"/>
+            <w:bCs/>
+            <w:szCs w:val="21"/>
+          </w:rPr>
+          <w:t>https://vuminorproblem.netlify.app/</w:t>
+        </w:r>
+      </w:hyperlink>
+      <w:r>
+        <w:rPr>
+          <w:rFonts w:ascii="Times New Roman" w:hAnsi="Times New Roman" w:cs="Times New Roman"/>
+          <w:bCs/>
+          <w:szCs w:val="21"/>
+        </w:rPr>
+        <w:t xml:space="preserve"> </w:t>
       </w:r>
     </w:p>
     <w:p>
@@ -1506,7 +2314,7 @@
           <w:sz w:val="22"/>
           <w:szCs w:val="22"/>
         </w:rPr>
-        <w:t xml:space="preserve">Trained new staff in CPR, water rescue, </w:t>
+        <w:t xml:space="preserve">Developed and maintained an interactive website for the </w:t>
       </w:r>
       <w:r>
         <w:rPr>
@@ -1514,7 +2322,7 @@
           <w:sz w:val="22"/>
           <w:szCs w:val="22"/>
         </w:rPr>
-        <w:t>risk assessment</w:t>
+        <w:t>organization</w:t>
       </w:r>
       <w:r>
         <w:rPr>
@@ -1522,107 +2330,7 @@
           <w:sz w:val="22"/>
           <w:szCs w:val="22"/>
         </w:rPr>
-        <w:t>/</w:t>
-      </w:r>
-      <w:r>
-        <w:rPr>
-          <w:bCs/>
-          <w:sz w:val="22"/>
-          <w:szCs w:val="22"/>
-        </w:rPr>
-        <w:t>prevention, and beach safety procedures</w:t>
-      </w:r>
-    </w:p>
-    <w:p>
-      <w:pPr>
-        <w:spacing w:after="0" w:line="240" w:lineRule="auto"/>
-        <w:rPr>
-          <w:rFonts w:ascii="Times New Roman" w:hAnsi="Times New Roman" w:cs="Times New Roman"/>
-          <w:b/>
-          <w:szCs w:val="21"/>
-        </w:rPr>
-      </w:pPr>
-    </w:p>
-    <w:p>
-      <w:pPr>
-        <w:spacing w:after="0" w:line="240" w:lineRule="auto"/>
-        <w:rPr>
-          <w:rFonts w:ascii="Times New Roman" w:hAnsi="Times New Roman" w:cs="Times New Roman"/>
-          <w:bCs/>
-          <w:szCs w:val="21"/>
-        </w:rPr>
-      </w:pPr>
-      <w:r>
-        <w:rPr>
-          <w:rFonts w:ascii="Times New Roman" w:hAnsi="Times New Roman" w:cs="Times New Roman"/>
-          <w:b/>
-          <w:szCs w:val="21"/>
-        </w:rPr>
-        <w:t xml:space="preserve">Villanova University </w:t>
-      </w:r>
-      <w:r>
-        <w:rPr>
-          <w:rFonts w:ascii="Times New Roman" w:hAnsi="Times New Roman" w:cs="Times New Roman"/>
-          <w:b/>
-          <w:szCs w:val="21"/>
-        </w:rPr>
-        <w:t>A Cappella</w:t>
-      </w:r>
-      <w:r>
-        <w:rPr>
-          <w:rFonts w:ascii="Times New Roman" w:hAnsi="Times New Roman" w:cs="Times New Roman"/>
-          <w:b/>
-          <w:szCs w:val="21"/>
-        </w:rPr>
-        <w:t xml:space="preserve"> </w:t>
-      </w:r>
-      <w:r>
-        <w:rPr>
-          <w:rFonts w:ascii="Times New Roman" w:hAnsi="Times New Roman" w:cs="Times New Roman"/>
-          <w:b/>
-          <w:szCs w:val="21"/>
-        </w:rPr>
-        <w:t xml:space="preserve">| </w:t>
-      </w:r>
-      <w:r>
-        <w:rPr>
-          <w:rFonts w:ascii="Times New Roman" w:hAnsi="Times New Roman" w:cs="Times New Roman"/>
-          <w:bCs/>
-          <w:szCs w:val="21"/>
-        </w:rPr>
-        <w:t>Web Developer, V</w:t>
-      </w:r>
-      <w:r>
-        <w:rPr>
-          <w:rFonts w:ascii="Times New Roman" w:hAnsi="Times New Roman" w:cs="Times New Roman"/>
-          <w:bCs/>
-          <w:szCs w:val="21"/>
-        </w:rPr>
-        <w:t xml:space="preserve">ocal Percussionist </w:t>
-      </w:r>
-      <w:r>
-        <w:rPr>
-          <w:rFonts w:ascii="Times New Roman" w:hAnsi="Times New Roman" w:cs="Times New Roman"/>
-          <w:bCs/>
-          <w:i/>
-          <w:iCs/>
-          <w:szCs w:val="21"/>
-        </w:rPr>
-        <w:t>(2023-Present)</w:t>
-      </w:r>
-      <w:r>
-        <w:rPr>
-          <w:rFonts w:ascii="Times New Roman" w:hAnsi="Times New Roman" w:cs="Times New Roman"/>
-          <w:bCs/>
-          <w:szCs w:val="21"/>
-        </w:rPr>
-        <w:t xml:space="preserve"> </w:t>
-      </w:r>
-      <w:r>
-        <w:rPr>
-          <w:szCs w:val="21"/>
-        </w:rPr>
-        <w:t xml:space="preserve"> </w:t>
+        <w:t xml:space="preserve"> including set lists, events, and ticket pages </w:t>
       </w:r>
     </w:p>
     <w:p>
@@ -1645,30 +2353,15 @@
           <w:sz w:val="22"/>
           <w:szCs w:val="22"/>
         </w:rPr>
-        <w:t xml:space="preserve">Developed and maintained an interactive website for the group including set lists, events, and ticket pages </w:t>
-      </w:r>
-    </w:p>
-    <w:p>
-      <w:pPr>
-        <w:pStyle w:val="ListParagraph"/>
-        <w:numPr>
-          <w:ilvl w:val="0"/>
-          <w:numId w:val="32"/>
-        </w:numPr>
-        <w:spacing w:line="240" w:lineRule="auto"/>
-        <w:jc w:val="left"/>
-        <w:rPr>
-          <w:b/>
-          <w:szCs w:val="21"/>
-        </w:rPr>
-      </w:pPr>
+        <w:t>Coordinated rehearsals, soundchecks, and performances as a group</w:t>
+      </w:r>
       <w:r>
         <w:rPr>
           <w:bCs/>
           <w:sz w:val="22"/>
           <w:szCs w:val="22"/>
         </w:rPr>
-        <w:t>Coordinated rehearsals, soundchecks, and performances as a group</w:t>
+        <w:t xml:space="preserve"> of </w:t>
       </w:r>
       <w:r>
         <w:rPr>
@@ -1676,52 +2369,13 @@
           <w:sz w:val="22"/>
           <w:szCs w:val="22"/>
         </w:rPr>
-        <w:t xml:space="preserve"> of </w:t>
-      </w:r>
-      <w:r>
-        <w:rPr>
-          <w:bCs/>
-          <w:sz w:val="22"/>
-          <w:szCs w:val="22"/>
-        </w:rPr>
         <w:t>10+ students</w:t>
-      </w:r>
-    </w:p>
-    <w:p>
-      <w:pPr>
-        <w:pStyle w:val="ListParagraph"/>
-        <w:numPr>
-          <w:ilvl w:val="0"/>
-          <w:numId w:val="32"/>
-        </w:numPr>
-        <w:spacing w:line="240" w:lineRule="auto"/>
-        <w:jc w:val="left"/>
-        <w:rPr>
-          <w:b/>
-          <w:szCs w:val="21"/>
-        </w:rPr>
-      </w:pPr>
-      <w:r>
-        <w:rPr>
-          <w:bCs/>
-          <w:sz w:val="22"/>
-          <w:szCs w:val="22"/>
-        </w:rPr>
-        <w:t>Worked as a team to ens</w:t>
-      </w:r>
-      <w:r>
-        <w:rPr>
-          <w:bCs/>
-          <w:sz w:val="22"/>
-          <w:szCs w:val="22"/>
-        </w:rPr>
-        <w:t>ure quality and consistency</w:t>
       </w:r>
     </w:p>
     <w:sectPr>
       <w:type w:val="continuous"/>
       <w:pgSz w:w="12240" w:h="15840"/>
-      <w:pgMar w:top="990" w:right="720" w:bottom="720" w:left="720" w:header="720" w:footer="720" w:gutter="0"/>
+      <w:pgMar w:top="720" w:right="720" w:bottom="720" w:left="720" w:header="720" w:footer="720" w:gutter="0"/>
       <w:cols w:space="720"/>
       <w:docGrid w:linePitch="299"/>
     </w:sectPr>
@@ -1800,8 +2454,7 @@
       <w:pStyle w:val="NoSpacing"/>
       <w:rPr>
         <w:rFonts w:ascii="Times New Roman" w:hAnsi="Times New Roman" w:cs="Times New Roman"/>
-        <w:b/>
-        <w:sz w:val="52"/>
+        <w:sz w:val="20"/>
         <w:szCs w:val="20"/>
       </w:rPr>
     </w:pPr>
@@ -1812,6 +2465,22 @@
         <w:sz w:val="56"/>
       </w:rPr>
       <w:t>Ryan Riccio</w:t>
+    </w:r>
+    <w:r>
+      <w:rPr>
+        <w:rFonts w:ascii="Times New Roman" w:hAnsi="Times New Roman" w:cs="Times New Roman"/>
+        <w:b/>
+        <w:sz w:val="56"/>
+      </w:rPr>
+      <w:t xml:space="preserve"> </w:t>
+    </w:r>
+    <w:r>
+      <w:rPr>
+        <w:rFonts w:ascii="Times New Roman" w:hAnsi="Times New Roman" w:cs="Times New Roman"/>
+        <w:sz w:val="20"/>
+        <w:szCs w:val="20"/>
+      </w:rPr>
+      <w:t xml:space="preserve">| Trumbull, CT </w:t>
     </w:r>
   </w:p>
   <w:p>
@@ -1829,7 +2498,7 @@
         <w:sz w:val="20"/>
         <w:szCs w:val="20"/>
       </w:rPr>
-      <w:t xml:space="preserve">Trumbull, CT | 203-258-6252 | </w:t>
+      <w:t xml:space="preserve">203-258-6252 | </w:t>
     </w:r>
     <w:hyperlink r:id="rId1" w:history="1">
       <w:r>
@@ -1850,60 +2519,40 @@
       </w:rPr>
       <w:t xml:space="preserve"> </w:t>
     </w:r>
-  </w:p>
-  <w:p>
-    <w:pPr>
-      <w:pStyle w:val="NoSpacing"/>
+    <w:r>
       <w:rPr>
         <w:rFonts w:ascii="Times New Roman" w:hAnsi="Times New Roman" w:cs="Times New Roman"/>
         <w:sz w:val="20"/>
         <w:szCs w:val="20"/>
       </w:rPr>
-    </w:pPr>
+      <w:t xml:space="preserve">| </w:t>
+    </w:r>
+    <w:hyperlink r:id="rId2" w:history="1">
+      <w:r>
+        <w:rPr>
+          <w:rStyle w:val="Hyperlink"/>
+          <w:rFonts w:ascii="Times New Roman" w:hAnsi="Times New Roman" w:cs="Times New Roman"/>
+          <w:sz w:val="20"/>
+          <w:szCs w:val="20"/>
+        </w:rPr>
+        <w:t>https://www.linkedin.com/in/ryan-riccio-541875270/</w:t>
+      </w:r>
+    </w:hyperlink>
     <w:r>
       <w:rPr>
         <w:rFonts w:ascii="Times New Roman" w:hAnsi="Times New Roman" w:cs="Times New Roman"/>
         <w:sz w:val="20"/>
         <w:szCs w:val="20"/>
       </w:rPr>
-      <w:t xml:space="preserve">LinkedIn: </w:t>
+      <w:t xml:space="preserve"> </w:t>
     </w:r>
-    <w:hyperlink r:id="rId2" w:history="1">
-      <w:r>
-        <w:rPr>
-          <w:rStyle w:val="Hyperlink"/>
-          <w:rFonts w:ascii="Times New Roman" w:hAnsi="Times New Roman" w:cs="Times New Roman"/>
-          <w:sz w:val="20"/>
-          <w:szCs w:val="20"/>
-        </w:rPr>
-        <w:t>https://www.linkedin.com/in/ryan-riccio-541875270/</w:t>
-      </w:r>
-    </w:hyperlink>
     <w:r>
       <w:rPr>
         <w:rFonts w:ascii="Times New Roman" w:hAnsi="Times New Roman" w:cs="Times New Roman"/>
         <w:sz w:val="20"/>
         <w:szCs w:val="20"/>
       </w:rPr>
-      <w:t xml:space="preserve"> </w:t>
-    </w:r>
-  </w:p>
-  <w:p>
-    <w:pPr>
-      <w:pStyle w:val="NoSpacing"/>
-      <w:rPr>
-        <w:rFonts w:ascii="Times New Roman" w:hAnsi="Times New Roman" w:cs="Times New Roman"/>
-        <w:sz w:val="20"/>
-        <w:szCs w:val="20"/>
-      </w:rPr>
-    </w:pPr>
-    <w:r>
-      <w:rPr>
-        <w:rFonts w:ascii="Times New Roman" w:hAnsi="Times New Roman" w:cs="Times New Roman"/>
-        <w:sz w:val="20"/>
-        <w:szCs w:val="20"/>
-      </w:rPr>
-      <w:t xml:space="preserve">GitHub: </w:t>
+      <w:t xml:space="preserve">| </w:t>
     </w:r>
     <w:hyperlink r:id="rId3" w:history="1">
       <w:r>
@@ -4899,6 +5548,119 @@
     </w:lvl>
   </w:abstractNum>
   <w:abstractNum w:abstractNumId="25" w15:restartNumberingAfterBreak="0">
+    <w:nsid w:val="6E114372"/>
+    <w:multiLevelType w:val="hybridMultilevel"/>
+    <w:tmpl w:val="78B67B6C"/>
+    <w:lvl w:ilvl="0" w:tplc="04090001">
+      <w:start w:val="1"/>
+      <w:numFmt w:val="bullet"/>
+      <w:lvlText w:val=""/>
+      <w:lvlJc w:val="left"/>
+      <w:pPr>
+        <w:ind w:left="720" w:hanging="360"/>
+      </w:pPr>
+      <w:rPr>
+        <w:rFonts w:ascii="Symbol" w:hAnsi="Symbol" w:hint="default"/>
+      </w:rPr>
+    </w:lvl>
+    <w:lvl w:ilvl="1" w:tplc="04090003" w:tentative="1">
+      <w:start w:val="1"/>
+      <w:numFmt w:val="bullet"/>
+      <w:lvlText w:val="o"/>
+      <w:lvlJc w:val="left"/>
+      <w:pPr>
+        <w:ind w:left="1440" w:hanging="360"/>
+      </w:pPr>
+      <w:rPr>
+        <w:rFonts w:ascii="Courier New" w:hAnsi="Courier New" w:cs="Courier New" w:hint="default"/>
+      </w:rPr>
+    </w:lvl>
+    <w:lvl w:ilvl="2" w:tplc="04090005" w:tentative="1">
+      <w:start w:val="1"/>
+      <w:numFmt w:val="bullet"/>
+      <w:lvlText w:val=""/>
+      <w:lvlJc w:val="left"/>
+      <w:pPr>
+        <w:ind w:left="2160" w:hanging="360"/>
+      </w:pPr>
+      <w:rPr>
+        <w:rFonts w:ascii="Wingdings" w:hAnsi="Wingdings" w:hint="default"/>
+      </w:rPr>
+    </w:lvl>
+    <w:lvl w:ilvl="3" w:tplc="04090001" w:tentative="1">
+      <w:start w:val="1"/>
+      <w:numFmt w:val="bullet"/>
+      <w:lvlText w:val=""/>
+      <w:lvlJc w:val="left"/>
+      <w:pPr>
+        <w:ind w:left="2880" w:hanging="360"/>
+      </w:pPr>
+      <w:rPr>
+        <w:rFonts w:ascii="Symbol" w:hAnsi="Symbol" w:hint="default"/>
+      </w:rPr>
+    </w:lvl>
+    <w:lvl w:ilvl="4" w:tplc="04090003" w:tentative="1">
+      <w:start w:val="1"/>
+      <w:numFmt w:val="bullet"/>
+      <w:lvlText w:val="o"/>
+      <w:lvlJc w:val="left"/>
+      <w:pPr>
+        <w:ind w:left="3600" w:hanging="360"/>
+      </w:pPr>
+      <w:rPr>
+        <w:rFonts w:ascii="Courier New" w:hAnsi="Courier New" w:cs="Courier New" w:hint="default"/>
+      </w:rPr>
+    </w:lvl>
+    <w:lvl w:ilvl="5" w:tplc="04090005" w:tentative="1">
+      <w:start w:val="1"/>
+      <w:numFmt w:val="bullet"/>
+      <w:lvlText w:val=""/>
+      <w:lvlJc w:val="left"/>
+      <w:pPr>
+        <w:ind w:left="4320" w:hanging="360"/>
+      </w:pPr>
+      <w:rPr>
+        <w:rFonts w:ascii="Wingdings" w:hAnsi="Wingdings" w:hint="default"/>
+      </w:rPr>
+    </w:lvl>
+    <w:lvl w:ilvl="6" w:tplc="04090001" w:tentative="1">
+      <w:start w:val="1"/>
+      <w:numFmt w:val="bullet"/>
+      <w:lvlText w:val=""/>
+      <w:lvlJc w:val="left"/>
+      <w:pPr>
+        <w:ind w:left="5040" w:hanging="360"/>
+      </w:pPr>
+      <w:rPr>
+        <w:rFonts w:ascii="Symbol" w:hAnsi="Symbol" w:hint="default"/>
+      </w:rPr>
+    </w:lvl>
+    <w:lvl w:ilvl="7" w:tplc="04090003" w:tentative="1">
+      <w:start w:val="1"/>
+      <w:numFmt w:val="bullet"/>
+      <w:lvlText w:val="o"/>
+      <w:lvlJc w:val="left"/>
+      <w:pPr>
+        <w:ind w:left="5760" w:hanging="360"/>
+      </w:pPr>
+      <w:rPr>
+        <w:rFonts w:ascii="Courier New" w:hAnsi="Courier New" w:cs="Courier New" w:hint="default"/>
+      </w:rPr>
+    </w:lvl>
+    <w:lvl w:ilvl="8" w:tplc="04090005" w:tentative="1">
+      <w:start w:val="1"/>
+      <w:numFmt w:val="bullet"/>
+      <w:lvlText w:val=""/>
+      <w:lvlJc w:val="left"/>
+      <w:pPr>
+        <w:ind w:left="6480" w:hanging="360"/>
+      </w:pPr>
+      <w:rPr>
+        <w:rFonts w:ascii="Wingdings" w:hAnsi="Wingdings" w:hint="default"/>
+      </w:rPr>
+    </w:lvl>
+  </w:abstractNum>
+  <w:abstractNum w:abstractNumId="26" w15:restartNumberingAfterBreak="0">
     <w:nsid w:val="6EE33D91"/>
     <w:multiLevelType w:val="hybridMultilevel"/>
     <w:tmpl w:val="5FE4030E"/>
@@ -5011,7 +5773,7 @@
       </w:rPr>
     </w:lvl>
   </w:abstractNum>
-  <w:abstractNum w:abstractNumId="26" w15:restartNumberingAfterBreak="0">
+  <w:abstractNum w:abstractNumId="27" w15:restartNumberingAfterBreak="0">
     <w:nsid w:val="70926E16"/>
     <w:multiLevelType w:val="hybridMultilevel"/>
     <w:tmpl w:val="37DC4CE6"/>
@@ -5124,7 +5886,7 @@
       </w:rPr>
     </w:lvl>
   </w:abstractNum>
-  <w:abstractNum w:abstractNumId="27" w15:restartNumberingAfterBreak="0">
+  <w:abstractNum w:abstractNumId="28" w15:restartNumberingAfterBreak="0">
     <w:nsid w:val="7311174A"/>
     <w:multiLevelType w:val="hybridMultilevel"/>
     <w:tmpl w:val="61BE2274"/>
@@ -5237,7 +5999,7 @@
       </w:rPr>
     </w:lvl>
   </w:abstractNum>
-  <w:abstractNum w:abstractNumId="28" w15:restartNumberingAfterBreak="0">
+  <w:abstractNum w:abstractNumId="29" w15:restartNumberingAfterBreak="0">
     <w:nsid w:val="74704C0E"/>
     <w:multiLevelType w:val="hybridMultilevel"/>
     <w:tmpl w:val="CDCCBAA0"/>
@@ -5350,7 +6112,120 @@
       </w:rPr>
     </w:lvl>
   </w:abstractNum>
-  <w:abstractNum w:abstractNumId="29" w15:restartNumberingAfterBreak="0">
+  <w:abstractNum w:abstractNumId="30" w15:restartNumberingAfterBreak="0">
+    <w:nsid w:val="750A549B"/>
+    <w:multiLevelType w:val="hybridMultilevel"/>
+    <w:tmpl w:val="260AB8A8"/>
+    <w:lvl w:ilvl="0" w:tplc="04090001">
+      <w:start w:val="1"/>
+      <w:numFmt w:val="bullet"/>
+      <w:lvlText w:val=""/>
+      <w:lvlJc w:val="left"/>
+      <w:pPr>
+        <w:ind w:left="720" w:hanging="360"/>
+      </w:pPr>
+      <w:rPr>
+        <w:rFonts w:ascii="Symbol" w:hAnsi="Symbol" w:hint="default"/>
+      </w:rPr>
+    </w:lvl>
+    <w:lvl w:ilvl="1" w:tplc="04090003" w:tentative="1">
+      <w:start w:val="1"/>
+      <w:numFmt w:val="bullet"/>
+      <w:lvlText w:val="o"/>
+      <w:lvlJc w:val="left"/>
+      <w:pPr>
+        <w:ind w:left="1440" w:hanging="360"/>
+      </w:pPr>
+      <w:rPr>
+        <w:rFonts w:ascii="Courier New" w:hAnsi="Courier New" w:cs="Courier New" w:hint="default"/>
+      </w:rPr>
+    </w:lvl>
+    <w:lvl w:ilvl="2" w:tplc="04090005" w:tentative="1">
+      <w:start w:val="1"/>
+      <w:numFmt w:val="bullet"/>
+      <w:lvlText w:val=""/>
+      <w:lvlJc w:val="left"/>
+      <w:pPr>
+        <w:ind w:left="2160" w:hanging="360"/>
+      </w:pPr>
+      <w:rPr>
+        <w:rFonts w:ascii="Wingdings" w:hAnsi="Wingdings" w:hint="default"/>
+      </w:rPr>
+    </w:lvl>
+    <w:lvl w:ilvl="3" w:tplc="04090001" w:tentative="1">
+      <w:start w:val="1"/>
+      <w:numFmt w:val="bullet"/>
+      <w:lvlText w:val=""/>
+      <w:lvlJc w:val="left"/>
+      <w:pPr>
+        <w:ind w:left="2880" w:hanging="360"/>
+      </w:pPr>
+      <w:rPr>
+        <w:rFonts w:ascii="Symbol" w:hAnsi="Symbol" w:hint="default"/>
+      </w:rPr>
+    </w:lvl>
+    <w:lvl w:ilvl="4" w:tplc="04090003" w:tentative="1">
+      <w:start w:val="1"/>
+      <w:numFmt w:val="bullet"/>
+      <w:lvlText w:val="o"/>
+      <w:lvlJc w:val="left"/>
+      <w:pPr>
+        <w:ind w:left="3600" w:hanging="360"/>
+      </w:pPr>
+      <w:rPr>
+        <w:rFonts w:ascii="Courier New" w:hAnsi="Courier New" w:cs="Courier New" w:hint="default"/>
+      </w:rPr>
+    </w:lvl>
+    <w:lvl w:ilvl="5" w:tplc="04090005" w:tentative="1">
+      <w:start w:val="1"/>
+      <w:numFmt w:val="bullet"/>
+      <w:lvlText w:val=""/>
+      <w:lvlJc w:val="left"/>
+      <w:pPr>
+        <w:ind w:left="4320" w:hanging="360"/>
+      </w:pPr>
+      <w:rPr>
+        <w:rFonts w:ascii="Wingdings" w:hAnsi="Wingdings" w:hint="default"/>
+      </w:rPr>
+    </w:lvl>
+    <w:lvl w:ilvl="6" w:tplc="04090001" w:tentative="1">
+      <w:start w:val="1"/>
+      <w:numFmt w:val="bullet"/>
+      <w:lvlText w:val=""/>
+      <w:lvlJc w:val="left"/>
+      <w:pPr>
+        <w:ind w:left="5040" w:hanging="360"/>
+      </w:pPr>
+      <w:rPr>
+        <w:rFonts w:ascii="Symbol" w:hAnsi="Symbol" w:hint="default"/>
+      </w:rPr>
+    </w:lvl>
+    <w:lvl w:ilvl="7" w:tplc="04090003" w:tentative="1">
+      <w:start w:val="1"/>
+      <w:numFmt w:val="bullet"/>
+      <w:lvlText w:val="o"/>
+      <w:lvlJc w:val="left"/>
+      <w:pPr>
+        <w:ind w:left="5760" w:hanging="360"/>
+      </w:pPr>
+      <w:rPr>
+        <w:rFonts w:ascii="Courier New" w:hAnsi="Courier New" w:cs="Courier New" w:hint="default"/>
+      </w:rPr>
+    </w:lvl>
+    <w:lvl w:ilvl="8" w:tplc="04090005" w:tentative="1">
+      <w:start w:val="1"/>
+      <w:numFmt w:val="bullet"/>
+      <w:lvlText w:val=""/>
+      <w:lvlJc w:val="left"/>
+      <w:pPr>
+        <w:ind w:left="6480" w:hanging="360"/>
+      </w:pPr>
+      <w:rPr>
+        <w:rFonts w:ascii="Wingdings" w:hAnsi="Wingdings" w:hint="default"/>
+      </w:rPr>
+    </w:lvl>
+  </w:abstractNum>
+  <w:abstractNum w:abstractNumId="31" w15:restartNumberingAfterBreak="0">
     <w:nsid w:val="760C71E3"/>
     <w:multiLevelType w:val="hybridMultilevel"/>
     <w:tmpl w:val="B928D2EE"/>
@@ -5463,7 +6338,7 @@
       </w:rPr>
     </w:lvl>
   </w:abstractNum>
-  <w:abstractNum w:abstractNumId="30" w15:restartNumberingAfterBreak="0">
+  <w:abstractNum w:abstractNumId="32" w15:restartNumberingAfterBreak="0">
     <w:nsid w:val="79D40C87"/>
     <w:multiLevelType w:val="hybridMultilevel"/>
     <w:tmpl w:val="002C0C88"/>
@@ -5576,7 +6451,7 @@
       </w:rPr>
     </w:lvl>
   </w:abstractNum>
-  <w:abstractNum w:abstractNumId="31" w15:restartNumberingAfterBreak="0">
+  <w:abstractNum w:abstractNumId="33" w15:restartNumberingAfterBreak="0">
     <w:nsid w:val="7CB15B39"/>
     <w:multiLevelType w:val="hybridMultilevel"/>
     <w:tmpl w:val="B9347F72"/>
@@ -5689,7 +6564,7 @@
       </w:rPr>
     </w:lvl>
   </w:abstractNum>
-  <w:abstractNum w:abstractNumId="32" w15:restartNumberingAfterBreak="0">
+  <w:abstractNum w:abstractNumId="34" w15:restartNumberingAfterBreak="0">
     <w:nsid w:val="7E76564B"/>
     <w:multiLevelType w:val="hybridMultilevel"/>
     <w:tmpl w:val="6C2EA580"/>
@@ -5815,7 +6690,7 @@
     <w:abstractNumId w:val="24"/>
   </w:num>
   <w:num w:numId="5" w16cid:durableId="335772293">
-    <w:abstractNumId w:val="32"/>
+    <w:abstractNumId w:val="34"/>
   </w:num>
   <w:num w:numId="6" w16cid:durableId="979653090">
     <w:abstractNumId w:val="13"/>
@@ -5827,10 +6702,10 @@
     <w:abstractNumId w:val="0"/>
   </w:num>
   <w:num w:numId="9" w16cid:durableId="947473179">
-    <w:abstractNumId w:val="29"/>
+    <w:abstractNumId w:val="31"/>
   </w:num>
   <w:num w:numId="10" w16cid:durableId="2013558012">
-    <w:abstractNumId w:val="31"/>
+    <w:abstractNumId w:val="33"/>
   </w:num>
   <w:num w:numId="11" w16cid:durableId="2047170384">
     <w:abstractNumId w:val="7"/>
@@ -5839,7 +6714,7 @@
     <w:abstractNumId w:val="19"/>
   </w:num>
   <w:num w:numId="13" w16cid:durableId="1811828364">
-    <w:abstractNumId w:val="25"/>
+    <w:abstractNumId w:val="26"/>
   </w:num>
   <w:num w:numId="14" w16cid:durableId="1848210204">
     <w:abstractNumId w:val="9"/>
@@ -5860,13 +6735,13 @@
     <w:abstractNumId w:val="21"/>
   </w:num>
   <w:num w:numId="20" w16cid:durableId="1804731797">
-    <w:abstractNumId w:val="28"/>
+    <w:abstractNumId w:val="29"/>
   </w:num>
   <w:num w:numId="21" w16cid:durableId="401028656">
     <w:abstractNumId w:val="5"/>
   </w:num>
   <w:num w:numId="22" w16cid:durableId="1882404171">
-    <w:abstractNumId w:val="27"/>
+    <w:abstractNumId w:val="28"/>
   </w:num>
   <w:num w:numId="23" w16cid:durableId="458572968">
     <w:abstractNumId w:val="15"/>
@@ -5875,10 +6750,10 @@
     <w:abstractNumId w:val="8"/>
   </w:num>
   <w:num w:numId="25" w16cid:durableId="1323854210">
-    <w:abstractNumId w:val="26"/>
+    <w:abstractNumId w:val="27"/>
   </w:num>
   <w:num w:numId="26" w16cid:durableId="488441845">
-    <w:abstractNumId w:val="30"/>
+    <w:abstractNumId w:val="32"/>
   </w:num>
   <w:num w:numId="27" w16cid:durableId="1270042282">
     <w:abstractNumId w:val="1"/>
@@ -5900,6 +6775,12 @@
   </w:num>
   <w:num w:numId="33" w16cid:durableId="1962808860">
     <w:abstractNumId w:val="14"/>
+  </w:num>
+  <w:num w:numId="34" w16cid:durableId="1729766971">
+    <w:abstractNumId w:val="25"/>
+  </w:num>
+  <w:num w:numId="35" w16cid:durableId="1542474656">
+    <w:abstractNumId w:val="30"/>
   </w:num>
 </w:numbering>
 </file>

</xml_diff>